<commit_message>
docs: data scope document in Outfit (the font of otwarte.miasto.lodz.pl), embedded
Co-Authored-By: Claude Opus 5.5 <noreply@anthropic.com>
Claude-Session: https://claude.ai/code/session_01DNGRWUZD1xLZ8KwwBcRF5A
</commit_message>
<xml_diff>
--- a/docs/Cool_Lodz_zakres_danych.docx
+++ b/docs/Cool_Lodz_zakres_danych.docx
@@ -9,7 +9,7 @@
       </w:pPr>
       <w:r>
         <w:rPr>
-          <w:rFonts w:ascii="Calibri" w:cs="Calibri" w:eastAsia="Calibri" w:hAnsi="Calibri"/>
+          <w:rFonts w:ascii="Outfit" w:cs="Outfit" w:eastAsia="Outfit" w:hAnsi="Outfit"/>
         </w:rPr>
         <w:t xml:space="preserve">Cool Łódź: zakres danych potrzebnych do aplikacji</w:t>
       </w:r>
@@ -20,7 +20,7 @@
       </w:pPr>
       <w:r>
         <w:rPr>
-          <w:rFonts w:ascii="Calibri" w:cs="Calibri" w:eastAsia="Calibri" w:hAnsi="Calibri"/>
+          <w:rFonts w:ascii="Outfit" w:cs="Outfit" w:eastAsia="Outfit" w:hAnsi="Outfit"/>
           <w:sz w:val="22"/>
           <w:szCs w:val="22"/>
         </w:rPr>
@@ -34,7 +34,7 @@
       </w:pPr>
       <w:r>
         <w:rPr>
-          <w:rFonts w:ascii="Calibri" w:cs="Calibri" w:eastAsia="Calibri" w:hAnsi="Calibri"/>
+          <w:rFonts w:ascii="Outfit" w:cs="Outfit" w:eastAsia="Outfit" w:hAnsi="Outfit"/>
         </w:rPr>
         <w:t xml:space="preserve">Wspólne zasady dla wszystkich plików</w:t>
       </w:r>
@@ -50,7 +50,7 @@
       </w:pPr>
       <w:r>
         <w:rPr>
-          <w:rFonts w:ascii="Calibri" w:cs="Calibri" w:eastAsia="Calibri" w:hAnsi="Calibri"/>
+          <w:rFonts w:ascii="Outfit" w:cs="Outfit" w:eastAsia="Outfit" w:hAnsi="Outfit"/>
           <w:sz w:val="22"/>
           <w:szCs w:val="22"/>
         </w:rPr>
@@ -68,7 +68,7 @@
       </w:pPr>
       <w:r>
         <w:rPr>
-          <w:rFonts w:ascii="Calibri" w:cs="Calibri" w:eastAsia="Calibri" w:hAnsi="Calibri"/>
+          <w:rFonts w:ascii="Outfit" w:cs="Outfit" w:eastAsia="Outfit" w:hAnsi="Outfit"/>
           <w:sz w:val="22"/>
           <w:szCs w:val="22"/>
         </w:rPr>
@@ -86,7 +86,7 @@
       </w:pPr>
       <w:r>
         <w:rPr>
-          <w:rFonts w:ascii="Calibri" w:cs="Calibri" w:eastAsia="Calibri" w:hAnsi="Calibri"/>
+          <w:rFonts w:ascii="Outfit" w:cs="Outfit" w:eastAsia="Outfit" w:hAnsi="Outfit"/>
           <w:sz w:val="22"/>
           <w:szCs w:val="22"/>
         </w:rPr>
@@ -104,7 +104,7 @@
       </w:pPr>
       <w:r>
         <w:rPr>
-          <w:rFonts w:ascii="Calibri" w:cs="Calibri" w:eastAsia="Calibri" w:hAnsi="Calibri"/>
+          <w:rFonts w:ascii="Outfit" w:cs="Outfit" w:eastAsia="Outfit" w:hAnsi="Outfit"/>
           <w:sz w:val="22"/>
           <w:szCs w:val="22"/>
         </w:rPr>
@@ -122,7 +122,7 @@
       </w:pPr>
       <w:r>
         <w:rPr>
-          <w:rFonts w:ascii="Calibri" w:cs="Calibri" w:eastAsia="Calibri" w:hAnsi="Calibri"/>
+          <w:rFonts w:ascii="Outfit" w:cs="Outfit" w:eastAsia="Outfit" w:hAnsi="Outfit"/>
           <w:sz w:val="22"/>
           <w:szCs w:val="22"/>
         </w:rPr>
@@ -140,7 +140,7 @@
       </w:pPr>
       <w:r>
         <w:rPr>
-          <w:rFonts w:ascii="Calibri" w:cs="Calibri" w:eastAsia="Calibri" w:hAnsi="Calibri"/>
+          <w:rFonts w:ascii="Outfit" w:cs="Outfit" w:eastAsia="Outfit" w:hAnsi="Outfit"/>
           <w:sz w:val="22"/>
           <w:szCs w:val="22"/>
         </w:rPr>
@@ -154,7 +154,7 @@
       </w:pPr>
       <w:r>
         <w:rPr>
-          <w:rFonts w:ascii="Calibri" w:cs="Calibri" w:eastAsia="Calibri" w:hAnsi="Calibri"/>
+          <w:rFonts w:ascii="Outfit" w:cs="Outfit" w:eastAsia="Outfit" w:hAnsi="Outfit"/>
         </w:rPr>
         <w:t xml:space="preserve">A. Niezbędne (bez nich nie ma prawdziwej aplikacji)</w:t>
       </w:r>
@@ -203,7 +203,7 @@
           <w:p>
             <w:r>
               <w:rPr>
-                <w:rFonts w:ascii="Calibri" w:cs="Calibri" w:eastAsia="Calibri" w:hAnsi="Calibri"/>
+                <w:rFonts w:ascii="Outfit" w:cs="Outfit" w:eastAsia="Outfit" w:hAnsi="Outfit"/>
                 <w:b/>
                 <w:bCs/>
                 <w:sz w:val="18"/>
@@ -233,7 +233,7 @@
           <w:p>
             <w:r>
               <w:rPr>
-                <w:rFonts w:ascii="Calibri" w:cs="Calibri" w:eastAsia="Calibri" w:hAnsi="Calibri"/>
+                <w:rFonts w:ascii="Outfit" w:cs="Outfit" w:eastAsia="Outfit" w:hAnsi="Outfit"/>
                 <w:b/>
                 <w:bCs/>
                 <w:sz w:val="18"/>
@@ -263,7 +263,7 @@
           <w:p>
             <w:r>
               <w:rPr>
-                <w:rFonts w:ascii="Calibri" w:cs="Calibri" w:eastAsia="Calibri" w:hAnsi="Calibri"/>
+                <w:rFonts w:ascii="Outfit" w:cs="Outfit" w:eastAsia="Outfit" w:hAnsi="Outfit"/>
                 <w:b/>
                 <w:bCs/>
                 <w:sz w:val="18"/>
@@ -293,7 +293,7 @@
           <w:p>
             <w:r>
               <w:rPr>
-                <w:rFonts w:ascii="Calibri" w:cs="Calibri" w:eastAsia="Calibri" w:hAnsi="Calibri"/>
+                <w:rFonts w:ascii="Outfit" w:cs="Outfit" w:eastAsia="Outfit" w:hAnsi="Outfit"/>
                 <w:b/>
                 <w:bCs/>
                 <w:sz w:val="18"/>
@@ -323,7 +323,7 @@
           <w:p>
             <w:r>
               <w:rPr>
-                <w:rFonts w:ascii="Calibri" w:cs="Calibri" w:eastAsia="Calibri" w:hAnsi="Calibri"/>
+                <w:rFonts w:ascii="Outfit" w:cs="Outfit" w:eastAsia="Outfit" w:hAnsi="Outfit"/>
                 <w:b/>
                 <w:bCs/>
                 <w:sz w:val="18"/>
@@ -353,7 +353,7 @@
           <w:p>
             <w:r>
               <w:rPr>
-                <w:rFonts w:ascii="Calibri" w:cs="Calibri" w:eastAsia="Calibri" w:hAnsi="Calibri"/>
+                <w:rFonts w:ascii="Outfit" w:cs="Outfit" w:eastAsia="Outfit" w:hAnsi="Outfit"/>
                 <w:b/>
                 <w:bCs/>
                 <w:sz w:val="18"/>
@@ -384,7 +384,7 @@
           <w:p>
             <w:r>
               <w:rPr>
-                <w:rFonts w:ascii="Calibri" w:cs="Calibri" w:eastAsia="Calibri" w:hAnsi="Calibri"/>
+                <w:rFonts w:ascii="Outfit" w:cs="Outfit" w:eastAsia="Outfit" w:hAnsi="Outfit"/>
                 <w:b w:val="false"/>
                 <w:bCs w:val="false"/>
                 <w:sz w:val="18"/>
@@ -413,7 +413,7 @@
           <w:p>
             <w:r>
               <w:rPr>
-                <w:rFonts w:ascii="Calibri" w:cs="Calibri" w:eastAsia="Calibri" w:hAnsi="Calibri"/>
+                <w:rFonts w:ascii="Outfit" w:cs="Outfit" w:eastAsia="Outfit" w:hAnsi="Outfit"/>
                 <w:b/>
                 <w:bCs/>
                 <w:sz w:val="18"/>
@@ -423,7 +423,7 @@
             </w:r>
             <w:r>
               <w:rPr>
-                <w:rFonts w:ascii="Calibri" w:cs="Calibri" w:eastAsia="Calibri" w:hAnsi="Calibri"/>
+                <w:rFonts w:ascii="Outfit" w:cs="Outfit" w:eastAsia="Outfit" w:hAnsi="Outfit"/>
                 <w:b w:val="false"/>
                 <w:bCs w:val="false"/>
                 <w:sz w:val="18"/>
@@ -452,7 +452,7 @@
           <w:p>
             <w:r>
               <w:rPr>
-                <w:rFonts w:ascii="Calibri" w:cs="Calibri" w:eastAsia="Calibri" w:hAnsi="Calibri"/>
+                <w:rFonts w:ascii="Outfit" w:cs="Outfit" w:eastAsia="Outfit" w:hAnsi="Outfit"/>
                 <w:b w:val="false"/>
                 <w:bCs w:val="false"/>
                 <w:sz w:val="18"/>
@@ -481,7 +481,7 @@
           <w:p>
             <w:r>
               <w:rPr>
-                <w:rFonts w:ascii="Calibri" w:cs="Calibri" w:eastAsia="Calibri" w:hAnsi="Calibri"/>
+                <w:rFonts w:ascii="Outfit" w:cs="Outfit" w:eastAsia="Outfit" w:hAnsi="Outfit"/>
                 <w:b w:val="false"/>
                 <w:bCs w:val="false"/>
                 <w:sz w:val="18"/>
@@ -510,7 +510,7 @@
           <w:p>
             <w:r>
               <w:rPr>
-                <w:rFonts w:ascii="Calibri" w:cs="Calibri" w:eastAsia="Calibri" w:hAnsi="Calibri"/>
+                <w:rFonts w:ascii="Outfit" w:cs="Outfit" w:eastAsia="Outfit" w:hAnsi="Outfit"/>
                 <w:b w:val="false"/>
                 <w:bCs w:val="false"/>
                 <w:sz w:val="18"/>
@@ -539,7 +539,7 @@
           <w:p>
             <w:r>
               <w:rPr>
-                <w:rFonts w:ascii="Calibri" w:cs="Calibri" w:eastAsia="Calibri" w:hAnsi="Calibri"/>
+                <w:rFonts w:ascii="Outfit" w:cs="Outfit" w:eastAsia="Outfit" w:hAnsi="Outfit"/>
                 <w:b w:val="false"/>
                 <w:bCs w:val="false"/>
                 <w:sz w:val="18"/>
@@ -570,7 +570,7 @@
           <w:p>
             <w:r>
               <w:rPr>
-                <w:rFonts w:ascii="Calibri" w:cs="Calibri" w:eastAsia="Calibri" w:hAnsi="Calibri"/>
+                <w:rFonts w:ascii="Outfit" w:cs="Outfit" w:eastAsia="Outfit" w:hAnsi="Outfit"/>
                 <w:b w:val="false"/>
                 <w:bCs w:val="false"/>
                 <w:sz w:val="18"/>
@@ -599,7 +599,7 @@
           <w:p>
             <w:r>
               <w:rPr>
-                <w:rFonts w:ascii="Calibri" w:cs="Calibri" w:eastAsia="Calibri" w:hAnsi="Calibri"/>
+                <w:rFonts w:ascii="Outfit" w:cs="Outfit" w:eastAsia="Outfit" w:hAnsi="Outfit"/>
                 <w:b/>
                 <w:bCs/>
                 <w:sz w:val="18"/>
@@ -628,7 +628,7 @@
           <w:p>
             <w:r>
               <w:rPr>
-                <w:rFonts w:ascii="Calibri" w:cs="Calibri" w:eastAsia="Calibri" w:hAnsi="Calibri"/>
+                <w:rFonts w:ascii="Outfit" w:cs="Outfit" w:eastAsia="Outfit" w:hAnsi="Outfit"/>
                 <w:b w:val="false"/>
                 <w:bCs w:val="false"/>
                 <w:sz w:val="18"/>
@@ -657,7 +657,7 @@
           <w:p>
             <w:r>
               <w:rPr>
-                <w:rFonts w:ascii="Calibri" w:cs="Calibri" w:eastAsia="Calibri" w:hAnsi="Calibri"/>
+                <w:rFonts w:ascii="Outfit" w:cs="Outfit" w:eastAsia="Outfit" w:hAnsi="Outfit"/>
                 <w:b w:val="false"/>
                 <w:bCs w:val="false"/>
                 <w:sz w:val="18"/>
@@ -686,7 +686,7 @@
           <w:p>
             <w:r>
               <w:rPr>
-                <w:rFonts w:ascii="Calibri" w:cs="Calibri" w:eastAsia="Calibri" w:hAnsi="Calibri"/>
+                <w:rFonts w:ascii="Outfit" w:cs="Outfit" w:eastAsia="Outfit" w:hAnsi="Outfit"/>
                 <w:b w:val="false"/>
                 <w:bCs w:val="false"/>
                 <w:sz w:val="18"/>
@@ -715,7 +715,7 @@
           <w:p>
             <w:r>
               <w:rPr>
-                <w:rFonts w:ascii="Calibri" w:cs="Calibri" w:eastAsia="Calibri" w:hAnsi="Calibri"/>
+                <w:rFonts w:ascii="Outfit" w:cs="Outfit" w:eastAsia="Outfit" w:hAnsi="Outfit"/>
                 <w:b w:val="false"/>
                 <w:bCs w:val="false"/>
                 <w:sz w:val="18"/>
@@ -746,7 +746,7 @@
           <w:p>
             <w:r>
               <w:rPr>
-                <w:rFonts w:ascii="Calibri" w:cs="Calibri" w:eastAsia="Calibri" w:hAnsi="Calibri"/>
+                <w:rFonts w:ascii="Outfit" w:cs="Outfit" w:eastAsia="Outfit" w:hAnsi="Outfit"/>
                 <w:b w:val="false"/>
                 <w:bCs w:val="false"/>
                 <w:sz w:val="18"/>
@@ -775,7 +775,7 @@
           <w:p>
             <w:r>
               <w:rPr>
-                <w:rFonts w:ascii="Calibri" w:cs="Calibri" w:eastAsia="Calibri" w:hAnsi="Calibri"/>
+                <w:rFonts w:ascii="Outfit" w:cs="Outfit" w:eastAsia="Outfit" w:hAnsi="Outfit"/>
                 <w:b/>
                 <w:bCs/>
                 <w:sz w:val="18"/>
@@ -785,7 +785,7 @@
             </w:r>
             <w:r>
               <w:rPr>
-                <w:rFonts w:ascii="Calibri" w:cs="Calibri" w:eastAsia="Calibri" w:hAnsi="Calibri"/>
+                <w:rFonts w:ascii="Outfit" w:cs="Outfit" w:eastAsia="Outfit" w:hAnsi="Outfit"/>
                 <w:b w:val="false"/>
                 <w:bCs w:val="false"/>
                 <w:sz w:val="18"/>
@@ -814,7 +814,7 @@
           <w:p>
             <w:r>
               <w:rPr>
-                <w:rFonts w:ascii="Calibri" w:cs="Calibri" w:eastAsia="Calibri" w:hAnsi="Calibri"/>
+                <w:rFonts w:ascii="Outfit" w:cs="Outfit" w:eastAsia="Outfit" w:hAnsi="Outfit"/>
                 <w:b w:val="false"/>
                 <w:bCs w:val="false"/>
                 <w:sz w:val="18"/>
@@ -843,7 +843,7 @@
           <w:p>
             <w:r>
               <w:rPr>
-                <w:rFonts w:ascii="Calibri" w:cs="Calibri" w:eastAsia="Calibri" w:hAnsi="Calibri"/>
+                <w:rFonts w:ascii="Outfit" w:cs="Outfit" w:eastAsia="Outfit" w:hAnsi="Outfit"/>
                 <w:b w:val="false"/>
                 <w:bCs w:val="false"/>
                 <w:sz w:val="18"/>
@@ -872,7 +872,7 @@
           <w:p>
             <w:r>
               <w:rPr>
-                <w:rFonts w:ascii="Calibri" w:cs="Calibri" w:eastAsia="Calibri" w:hAnsi="Calibri"/>
+                <w:rFonts w:ascii="Outfit" w:cs="Outfit" w:eastAsia="Outfit" w:hAnsi="Outfit"/>
                 <w:b w:val="false"/>
                 <w:bCs w:val="false"/>
                 <w:sz w:val="18"/>
@@ -901,7 +901,7 @@
           <w:p>
             <w:r>
               <w:rPr>
-                <w:rFonts w:ascii="Calibri" w:cs="Calibri" w:eastAsia="Calibri" w:hAnsi="Calibri"/>
+                <w:rFonts w:ascii="Outfit" w:cs="Outfit" w:eastAsia="Outfit" w:hAnsi="Outfit"/>
                 <w:b w:val="false"/>
                 <w:bCs w:val="false"/>
                 <w:sz w:val="18"/>
@@ -932,7 +932,7 @@
           <w:p>
             <w:r>
               <w:rPr>
-                <w:rFonts w:ascii="Calibri" w:cs="Calibri" w:eastAsia="Calibri" w:hAnsi="Calibri"/>
+                <w:rFonts w:ascii="Outfit" w:cs="Outfit" w:eastAsia="Outfit" w:hAnsi="Outfit"/>
                 <w:b w:val="false"/>
                 <w:bCs w:val="false"/>
                 <w:sz w:val="18"/>
@@ -961,7 +961,7 @@
           <w:p>
             <w:r>
               <w:rPr>
-                <w:rFonts w:ascii="Calibri" w:cs="Calibri" w:eastAsia="Calibri" w:hAnsi="Calibri"/>
+                <w:rFonts w:ascii="Outfit" w:cs="Outfit" w:eastAsia="Outfit" w:hAnsi="Outfit"/>
                 <w:b/>
                 <w:bCs/>
                 <w:sz w:val="18"/>
@@ -971,7 +971,7 @@
             </w:r>
             <w:r>
               <w:rPr>
-                <w:rFonts w:ascii="Calibri" w:cs="Calibri" w:eastAsia="Calibri" w:hAnsi="Calibri"/>
+                <w:rFonts w:ascii="Outfit" w:cs="Outfit" w:eastAsia="Outfit" w:hAnsi="Outfit"/>
                 <w:b w:val="false"/>
                 <w:bCs w:val="false"/>
                 <w:sz w:val="18"/>
@@ -1000,7 +1000,7 @@
           <w:p>
             <w:r>
               <w:rPr>
-                <w:rFonts w:ascii="Calibri" w:cs="Calibri" w:eastAsia="Calibri" w:hAnsi="Calibri"/>
+                <w:rFonts w:ascii="Outfit" w:cs="Outfit" w:eastAsia="Outfit" w:hAnsi="Outfit"/>
                 <w:b w:val="false"/>
                 <w:bCs w:val="false"/>
                 <w:sz w:val="18"/>
@@ -1029,7 +1029,7 @@
           <w:p>
             <w:r>
               <w:rPr>
-                <w:rFonts w:ascii="Calibri" w:cs="Calibri" w:eastAsia="Calibri" w:hAnsi="Calibri"/>
+                <w:rFonts w:ascii="Outfit" w:cs="Outfit" w:eastAsia="Outfit" w:hAnsi="Outfit"/>
                 <w:b w:val="false"/>
                 <w:bCs w:val="false"/>
                 <w:sz w:val="18"/>
@@ -1058,7 +1058,7 @@
           <w:p>
             <w:r>
               <w:rPr>
-                <w:rFonts w:ascii="Calibri" w:cs="Calibri" w:eastAsia="Calibri" w:hAnsi="Calibri"/>
+                <w:rFonts w:ascii="Outfit" w:cs="Outfit" w:eastAsia="Outfit" w:hAnsi="Outfit"/>
                 <w:b w:val="false"/>
                 <w:bCs w:val="false"/>
                 <w:sz w:val="18"/>
@@ -1087,7 +1087,7 @@
           <w:p>
             <w:r>
               <w:rPr>
-                <w:rFonts w:ascii="Calibri" w:cs="Calibri" w:eastAsia="Calibri" w:hAnsi="Calibri"/>
+                <w:rFonts w:ascii="Outfit" w:cs="Outfit" w:eastAsia="Outfit" w:hAnsi="Outfit"/>
                 <w:b w:val="false"/>
                 <w:bCs w:val="false"/>
                 <w:sz w:val="18"/>
@@ -1118,7 +1118,7 @@
           <w:p>
             <w:r>
               <w:rPr>
-                <w:rFonts w:ascii="Calibri" w:cs="Calibri" w:eastAsia="Calibri" w:hAnsi="Calibri"/>
+                <w:rFonts w:ascii="Outfit" w:cs="Outfit" w:eastAsia="Outfit" w:hAnsi="Outfit"/>
                 <w:b w:val="false"/>
                 <w:bCs w:val="false"/>
                 <w:sz w:val="18"/>
@@ -1147,7 +1147,7 @@
           <w:p>
             <w:r>
               <w:rPr>
-                <w:rFonts w:ascii="Calibri" w:cs="Calibri" w:eastAsia="Calibri" w:hAnsi="Calibri"/>
+                <w:rFonts w:ascii="Outfit" w:cs="Outfit" w:eastAsia="Outfit" w:hAnsi="Outfit"/>
                 <w:b/>
                 <w:bCs/>
                 <w:sz w:val="18"/>
@@ -1176,7 +1176,7 @@
           <w:p>
             <w:r>
               <w:rPr>
-                <w:rFonts w:ascii="Calibri" w:cs="Calibri" w:eastAsia="Calibri" w:hAnsi="Calibri"/>
+                <w:rFonts w:ascii="Outfit" w:cs="Outfit" w:eastAsia="Outfit" w:hAnsi="Outfit"/>
                 <w:b w:val="false"/>
                 <w:bCs w:val="false"/>
                 <w:sz w:val="18"/>
@@ -1205,7 +1205,7 @@
           <w:p>
             <w:r>
               <w:rPr>
-                <w:rFonts w:ascii="Calibri" w:cs="Calibri" w:eastAsia="Calibri" w:hAnsi="Calibri"/>
+                <w:rFonts w:ascii="Outfit" w:cs="Outfit" w:eastAsia="Outfit" w:hAnsi="Outfit"/>
                 <w:b w:val="false"/>
                 <w:bCs w:val="false"/>
                 <w:sz w:val="18"/>
@@ -1234,7 +1234,7 @@
           <w:p>
             <w:r>
               <w:rPr>
-                <w:rFonts w:ascii="Calibri" w:cs="Calibri" w:eastAsia="Calibri" w:hAnsi="Calibri"/>
+                <w:rFonts w:ascii="Outfit" w:cs="Outfit" w:eastAsia="Outfit" w:hAnsi="Outfit"/>
                 <w:b w:val="false"/>
                 <w:bCs w:val="false"/>
                 <w:sz w:val="18"/>
@@ -1263,7 +1263,7 @@
           <w:p>
             <w:r>
               <w:rPr>
-                <w:rFonts w:ascii="Calibri" w:cs="Calibri" w:eastAsia="Calibri" w:hAnsi="Calibri"/>
+                <w:rFonts w:ascii="Outfit" w:cs="Outfit" w:eastAsia="Outfit" w:hAnsi="Outfit"/>
                 <w:b w:val="false"/>
                 <w:bCs w:val="false"/>
                 <w:sz w:val="18"/>
@@ -1294,7 +1294,7 @@
           <w:p>
             <w:r>
               <w:rPr>
-                <w:rFonts w:ascii="Calibri" w:cs="Calibri" w:eastAsia="Calibri" w:hAnsi="Calibri"/>
+                <w:rFonts w:ascii="Outfit" w:cs="Outfit" w:eastAsia="Outfit" w:hAnsi="Outfit"/>
                 <w:b w:val="false"/>
                 <w:bCs w:val="false"/>
                 <w:sz w:val="18"/>
@@ -1323,7 +1323,7 @@
           <w:p>
             <w:r>
               <w:rPr>
-                <w:rFonts w:ascii="Calibri" w:cs="Calibri" w:eastAsia="Calibri" w:hAnsi="Calibri"/>
+                <w:rFonts w:ascii="Outfit" w:cs="Outfit" w:eastAsia="Outfit" w:hAnsi="Outfit"/>
                 <w:b/>
                 <w:bCs/>
                 <w:sz w:val="18"/>
@@ -1352,7 +1352,7 @@
           <w:p>
             <w:r>
               <w:rPr>
-                <w:rFonts w:ascii="Calibri" w:cs="Calibri" w:eastAsia="Calibri" w:hAnsi="Calibri"/>
+                <w:rFonts w:ascii="Outfit" w:cs="Outfit" w:eastAsia="Outfit" w:hAnsi="Outfit"/>
                 <w:b w:val="false"/>
                 <w:bCs w:val="false"/>
                 <w:sz w:val="18"/>
@@ -1381,7 +1381,7 @@
           <w:p>
             <w:r>
               <w:rPr>
-                <w:rFonts w:ascii="Calibri" w:cs="Calibri" w:eastAsia="Calibri" w:hAnsi="Calibri"/>
+                <w:rFonts w:ascii="Outfit" w:cs="Outfit" w:eastAsia="Outfit" w:hAnsi="Outfit"/>
                 <w:b w:val="false"/>
                 <w:bCs w:val="false"/>
                 <w:sz w:val="18"/>
@@ -1410,7 +1410,7 @@
           <w:p>
             <w:r>
               <w:rPr>
-                <w:rFonts w:ascii="Calibri" w:cs="Calibri" w:eastAsia="Calibri" w:hAnsi="Calibri"/>
+                <w:rFonts w:ascii="Outfit" w:cs="Outfit" w:eastAsia="Outfit" w:hAnsi="Outfit"/>
                 <w:b w:val="false"/>
                 <w:bCs w:val="false"/>
                 <w:sz w:val="18"/>
@@ -1439,7 +1439,7 @@
           <w:p>
             <w:r>
               <w:rPr>
-                <w:rFonts w:ascii="Calibri" w:cs="Calibri" w:eastAsia="Calibri" w:hAnsi="Calibri"/>
+                <w:rFonts w:ascii="Outfit" w:cs="Outfit" w:eastAsia="Outfit" w:hAnsi="Outfit"/>
                 <w:b w:val="false"/>
                 <w:bCs w:val="false"/>
                 <w:sz w:val="18"/>
@@ -1470,7 +1470,7 @@
           <w:p>
             <w:r>
               <w:rPr>
-                <w:rFonts w:ascii="Calibri" w:cs="Calibri" w:eastAsia="Calibri" w:hAnsi="Calibri"/>
+                <w:rFonts w:ascii="Outfit" w:cs="Outfit" w:eastAsia="Outfit" w:hAnsi="Outfit"/>
                 <w:b w:val="false"/>
                 <w:bCs w:val="false"/>
                 <w:sz w:val="18"/>
@@ -1499,7 +1499,7 @@
           <w:p>
             <w:r>
               <w:rPr>
-                <w:rFonts w:ascii="Calibri" w:cs="Calibri" w:eastAsia="Calibri" w:hAnsi="Calibri"/>
+                <w:rFonts w:ascii="Outfit" w:cs="Outfit" w:eastAsia="Outfit" w:hAnsi="Outfit"/>
                 <w:b/>
                 <w:bCs/>
                 <w:sz w:val="18"/>
@@ -1509,7 +1509,7 @@
             </w:r>
             <w:r>
               <w:rPr>
-                <w:rFonts w:ascii="Calibri" w:cs="Calibri" w:eastAsia="Calibri" w:hAnsi="Calibri"/>
+                <w:rFonts w:ascii="Outfit" w:cs="Outfit" w:eastAsia="Outfit" w:hAnsi="Outfit"/>
                 <w:b w:val="false"/>
                 <w:bCs w:val="false"/>
                 <w:sz w:val="18"/>
@@ -1538,7 +1538,7 @@
           <w:p>
             <w:r>
               <w:rPr>
-                <w:rFonts w:ascii="Calibri" w:cs="Calibri" w:eastAsia="Calibri" w:hAnsi="Calibri"/>
+                <w:rFonts w:ascii="Outfit" w:cs="Outfit" w:eastAsia="Outfit" w:hAnsi="Outfit"/>
                 <w:b w:val="false"/>
                 <w:bCs w:val="false"/>
                 <w:sz w:val="18"/>
@@ -1567,7 +1567,7 @@
           <w:p>
             <w:r>
               <w:rPr>
-                <w:rFonts w:ascii="Calibri" w:cs="Calibri" w:eastAsia="Calibri" w:hAnsi="Calibri"/>
+                <w:rFonts w:ascii="Outfit" w:cs="Outfit" w:eastAsia="Outfit" w:hAnsi="Outfit"/>
                 <w:b w:val="false"/>
                 <w:bCs w:val="false"/>
                 <w:sz w:val="18"/>
@@ -1596,7 +1596,7 @@
           <w:p>
             <w:r>
               <w:rPr>
-                <w:rFonts w:ascii="Calibri" w:cs="Calibri" w:eastAsia="Calibri" w:hAnsi="Calibri"/>
+                <w:rFonts w:ascii="Outfit" w:cs="Outfit" w:eastAsia="Outfit" w:hAnsi="Outfit"/>
                 <w:b w:val="false"/>
                 <w:bCs w:val="false"/>
                 <w:sz w:val="18"/>
@@ -1625,7 +1625,7 @@
           <w:p>
             <w:r>
               <w:rPr>
-                <w:rFonts w:ascii="Calibri" w:cs="Calibri" w:eastAsia="Calibri" w:hAnsi="Calibri"/>
+                <w:rFonts w:ascii="Outfit" w:cs="Outfit" w:eastAsia="Outfit" w:hAnsi="Outfit"/>
                 <w:b w:val="false"/>
                 <w:bCs w:val="false"/>
                 <w:sz w:val="18"/>
@@ -1644,7 +1644,7 @@
       </w:pPr>
       <w:r>
         <w:rPr>
-          <w:rFonts w:ascii="Calibri" w:cs="Calibri" w:eastAsia="Calibri" w:hAnsi="Calibri"/>
+          <w:rFonts w:ascii="Outfit" w:cs="Outfit" w:eastAsia="Outfit" w:hAnsi="Outfit"/>
         </w:rPr>
         <w:t xml:space="preserve">B. Ważne (dziś szacunek, z danymi miasta będą wiarygodne)</w:t>
       </w:r>
@@ -1693,7 +1693,7 @@
           <w:p>
             <w:r>
               <w:rPr>
-                <w:rFonts w:ascii="Calibri" w:cs="Calibri" w:eastAsia="Calibri" w:hAnsi="Calibri"/>
+                <w:rFonts w:ascii="Outfit" w:cs="Outfit" w:eastAsia="Outfit" w:hAnsi="Outfit"/>
                 <w:b/>
                 <w:bCs/>
                 <w:sz w:val="18"/>
@@ -1723,7 +1723,7 @@
           <w:p>
             <w:r>
               <w:rPr>
-                <w:rFonts w:ascii="Calibri" w:cs="Calibri" w:eastAsia="Calibri" w:hAnsi="Calibri"/>
+                <w:rFonts w:ascii="Outfit" w:cs="Outfit" w:eastAsia="Outfit" w:hAnsi="Outfit"/>
                 <w:b/>
                 <w:bCs/>
                 <w:sz w:val="18"/>
@@ -1753,7 +1753,7 @@
           <w:p>
             <w:r>
               <w:rPr>
-                <w:rFonts w:ascii="Calibri" w:cs="Calibri" w:eastAsia="Calibri" w:hAnsi="Calibri"/>
+                <w:rFonts w:ascii="Outfit" w:cs="Outfit" w:eastAsia="Outfit" w:hAnsi="Outfit"/>
                 <w:b/>
                 <w:bCs/>
                 <w:sz w:val="18"/>
@@ -1783,7 +1783,7 @@
           <w:p>
             <w:r>
               <w:rPr>
-                <w:rFonts w:ascii="Calibri" w:cs="Calibri" w:eastAsia="Calibri" w:hAnsi="Calibri"/>
+                <w:rFonts w:ascii="Outfit" w:cs="Outfit" w:eastAsia="Outfit" w:hAnsi="Outfit"/>
                 <w:b/>
                 <w:bCs/>
                 <w:sz w:val="18"/>
@@ -1813,7 +1813,7 @@
           <w:p>
             <w:r>
               <w:rPr>
-                <w:rFonts w:ascii="Calibri" w:cs="Calibri" w:eastAsia="Calibri" w:hAnsi="Calibri"/>
+                <w:rFonts w:ascii="Outfit" w:cs="Outfit" w:eastAsia="Outfit" w:hAnsi="Outfit"/>
                 <w:b/>
                 <w:bCs/>
                 <w:sz w:val="18"/>
@@ -1843,7 +1843,7 @@
           <w:p>
             <w:r>
               <w:rPr>
-                <w:rFonts w:ascii="Calibri" w:cs="Calibri" w:eastAsia="Calibri" w:hAnsi="Calibri"/>
+                <w:rFonts w:ascii="Outfit" w:cs="Outfit" w:eastAsia="Outfit" w:hAnsi="Outfit"/>
                 <w:b/>
                 <w:bCs/>
                 <w:sz w:val="18"/>
@@ -1874,7 +1874,7 @@
           <w:p>
             <w:r>
               <w:rPr>
-                <w:rFonts w:ascii="Calibri" w:cs="Calibri" w:eastAsia="Calibri" w:hAnsi="Calibri"/>
+                <w:rFonts w:ascii="Outfit" w:cs="Outfit" w:eastAsia="Outfit" w:hAnsi="Outfit"/>
                 <w:b w:val="false"/>
                 <w:bCs w:val="false"/>
                 <w:sz w:val="18"/>
@@ -1903,7 +1903,7 @@
           <w:p>
             <w:r>
               <w:rPr>
-                <w:rFonts w:ascii="Calibri" w:cs="Calibri" w:eastAsia="Calibri" w:hAnsi="Calibri"/>
+                <w:rFonts w:ascii="Outfit" w:cs="Outfit" w:eastAsia="Outfit" w:hAnsi="Outfit"/>
                 <w:b/>
                 <w:bCs/>
                 <w:sz w:val="18"/>
@@ -1913,7 +1913,7 @@
             </w:r>
             <w:r>
               <w:rPr>
-                <w:rFonts w:ascii="Calibri" w:cs="Calibri" w:eastAsia="Calibri" w:hAnsi="Calibri"/>
+                <w:rFonts w:ascii="Outfit" w:cs="Outfit" w:eastAsia="Outfit" w:hAnsi="Outfit"/>
                 <w:b w:val="false"/>
                 <w:bCs w:val="false"/>
                 <w:sz w:val="18"/>
@@ -1942,7 +1942,7 @@
           <w:p>
             <w:r>
               <w:rPr>
-                <w:rFonts w:ascii="Calibri" w:cs="Calibri" w:eastAsia="Calibri" w:hAnsi="Calibri"/>
+                <w:rFonts w:ascii="Outfit" w:cs="Outfit" w:eastAsia="Outfit" w:hAnsi="Outfit"/>
                 <w:b w:val="false"/>
                 <w:bCs w:val="false"/>
                 <w:sz w:val="18"/>
@@ -1971,7 +1971,7 @@
           <w:p>
             <w:r>
               <w:rPr>
-                <w:rFonts w:ascii="Calibri" w:cs="Calibri" w:eastAsia="Calibri" w:hAnsi="Calibri"/>
+                <w:rFonts w:ascii="Outfit" w:cs="Outfit" w:eastAsia="Outfit" w:hAnsi="Outfit"/>
                 <w:b w:val="false"/>
                 <w:bCs w:val="false"/>
                 <w:sz w:val="18"/>
@@ -2000,7 +2000,7 @@
           <w:p>
             <w:r>
               <w:rPr>
-                <w:rFonts w:ascii="Calibri" w:cs="Calibri" w:eastAsia="Calibri" w:hAnsi="Calibri"/>
+                <w:rFonts w:ascii="Outfit" w:cs="Outfit" w:eastAsia="Outfit" w:hAnsi="Outfit"/>
                 <w:b w:val="false"/>
                 <w:bCs w:val="false"/>
                 <w:sz w:val="18"/>
@@ -2029,7 +2029,7 @@
           <w:p>
             <w:r>
               <w:rPr>
-                <w:rFonts w:ascii="Calibri" w:cs="Calibri" w:eastAsia="Calibri" w:hAnsi="Calibri"/>
+                <w:rFonts w:ascii="Outfit" w:cs="Outfit" w:eastAsia="Outfit" w:hAnsi="Outfit"/>
                 <w:b w:val="false"/>
                 <w:bCs w:val="false"/>
                 <w:sz w:val="18"/>
@@ -2060,7 +2060,7 @@
           <w:p>
             <w:r>
               <w:rPr>
-                <w:rFonts w:ascii="Calibri" w:cs="Calibri" w:eastAsia="Calibri" w:hAnsi="Calibri"/>
+                <w:rFonts w:ascii="Outfit" w:cs="Outfit" w:eastAsia="Outfit" w:hAnsi="Outfit"/>
                 <w:b w:val="false"/>
                 <w:bCs w:val="false"/>
                 <w:sz w:val="18"/>
@@ -2089,7 +2089,7 @@
           <w:p>
             <w:r>
               <w:rPr>
-                <w:rFonts w:ascii="Calibri" w:cs="Calibri" w:eastAsia="Calibri" w:hAnsi="Calibri"/>
+                <w:rFonts w:ascii="Outfit" w:cs="Outfit" w:eastAsia="Outfit" w:hAnsi="Outfit"/>
                 <w:b/>
                 <w:bCs/>
                 <w:sz w:val="18"/>
@@ -2118,7 +2118,7 @@
           <w:p>
             <w:r>
               <w:rPr>
-                <w:rFonts w:ascii="Calibri" w:cs="Calibri" w:eastAsia="Calibri" w:hAnsi="Calibri"/>
+                <w:rFonts w:ascii="Outfit" w:cs="Outfit" w:eastAsia="Outfit" w:hAnsi="Outfit"/>
                 <w:b w:val="false"/>
                 <w:bCs w:val="false"/>
                 <w:sz w:val="18"/>
@@ -2147,7 +2147,7 @@
           <w:p>
             <w:r>
               <w:rPr>
-                <w:rFonts w:ascii="Calibri" w:cs="Calibri" w:eastAsia="Calibri" w:hAnsi="Calibri"/>
+                <w:rFonts w:ascii="Outfit" w:cs="Outfit" w:eastAsia="Outfit" w:hAnsi="Outfit"/>
                 <w:b w:val="false"/>
                 <w:bCs w:val="false"/>
                 <w:sz w:val="18"/>
@@ -2176,7 +2176,7 @@
           <w:p>
             <w:r>
               <w:rPr>
-                <w:rFonts w:ascii="Calibri" w:cs="Calibri" w:eastAsia="Calibri" w:hAnsi="Calibri"/>
+                <w:rFonts w:ascii="Outfit" w:cs="Outfit" w:eastAsia="Outfit" w:hAnsi="Outfit"/>
                 <w:b w:val="false"/>
                 <w:bCs w:val="false"/>
                 <w:sz w:val="18"/>
@@ -2205,7 +2205,7 @@
           <w:p>
             <w:r>
               <w:rPr>
-                <w:rFonts w:ascii="Calibri" w:cs="Calibri" w:eastAsia="Calibri" w:hAnsi="Calibri"/>
+                <w:rFonts w:ascii="Outfit" w:cs="Outfit" w:eastAsia="Outfit" w:hAnsi="Outfit"/>
                 <w:b w:val="false"/>
                 <w:bCs w:val="false"/>
                 <w:sz w:val="18"/>
@@ -2236,7 +2236,7 @@
           <w:p>
             <w:r>
               <w:rPr>
-                <w:rFonts w:ascii="Calibri" w:cs="Calibri" w:eastAsia="Calibri" w:hAnsi="Calibri"/>
+                <w:rFonts w:ascii="Outfit" w:cs="Outfit" w:eastAsia="Outfit" w:hAnsi="Outfit"/>
                 <w:b w:val="false"/>
                 <w:bCs w:val="false"/>
                 <w:sz w:val="18"/>
@@ -2265,7 +2265,7 @@
           <w:p>
             <w:r>
               <w:rPr>
-                <w:rFonts w:ascii="Calibri" w:cs="Calibri" w:eastAsia="Calibri" w:hAnsi="Calibri"/>
+                <w:rFonts w:ascii="Outfit" w:cs="Outfit" w:eastAsia="Outfit" w:hAnsi="Outfit"/>
                 <w:b/>
                 <w:bCs/>
                 <w:sz w:val="18"/>
@@ -2294,7 +2294,7 @@
           <w:p>
             <w:r>
               <w:rPr>
-                <w:rFonts w:ascii="Calibri" w:cs="Calibri" w:eastAsia="Calibri" w:hAnsi="Calibri"/>
+                <w:rFonts w:ascii="Outfit" w:cs="Outfit" w:eastAsia="Outfit" w:hAnsi="Outfit"/>
                 <w:b w:val="false"/>
                 <w:bCs w:val="false"/>
                 <w:sz w:val="18"/>
@@ -2323,7 +2323,7 @@
           <w:p>
             <w:r>
               <w:rPr>
-                <w:rFonts w:ascii="Calibri" w:cs="Calibri" w:eastAsia="Calibri" w:hAnsi="Calibri"/>
+                <w:rFonts w:ascii="Outfit" w:cs="Outfit" w:eastAsia="Outfit" w:hAnsi="Outfit"/>
                 <w:b w:val="false"/>
                 <w:bCs w:val="false"/>
                 <w:sz w:val="18"/>
@@ -2352,7 +2352,7 @@
           <w:p>
             <w:r>
               <w:rPr>
-                <w:rFonts w:ascii="Calibri" w:cs="Calibri" w:eastAsia="Calibri" w:hAnsi="Calibri"/>
+                <w:rFonts w:ascii="Outfit" w:cs="Outfit" w:eastAsia="Outfit" w:hAnsi="Outfit"/>
                 <w:b w:val="false"/>
                 <w:bCs w:val="false"/>
                 <w:sz w:val="18"/>
@@ -2381,7 +2381,7 @@
           <w:p>
             <w:r>
               <w:rPr>
-                <w:rFonts w:ascii="Calibri" w:cs="Calibri" w:eastAsia="Calibri" w:hAnsi="Calibri"/>
+                <w:rFonts w:ascii="Outfit" w:cs="Outfit" w:eastAsia="Outfit" w:hAnsi="Outfit"/>
                 <w:b w:val="false"/>
                 <w:bCs w:val="false"/>
                 <w:sz w:val="18"/>
@@ -2412,7 +2412,7 @@
           <w:p>
             <w:r>
               <w:rPr>
-                <w:rFonts w:ascii="Calibri" w:cs="Calibri" w:eastAsia="Calibri" w:hAnsi="Calibri"/>
+                <w:rFonts w:ascii="Outfit" w:cs="Outfit" w:eastAsia="Outfit" w:hAnsi="Outfit"/>
                 <w:b w:val="false"/>
                 <w:bCs w:val="false"/>
                 <w:sz w:val="18"/>
@@ -2441,7 +2441,7 @@
           <w:p>
             <w:r>
               <w:rPr>
-                <w:rFonts w:ascii="Calibri" w:cs="Calibri" w:eastAsia="Calibri" w:hAnsi="Calibri"/>
+                <w:rFonts w:ascii="Outfit" w:cs="Outfit" w:eastAsia="Outfit" w:hAnsi="Outfit"/>
                 <w:b/>
                 <w:bCs/>
                 <w:sz w:val="18"/>
@@ -2451,7 +2451,7 @@
             </w:r>
             <w:r>
               <w:rPr>
-                <w:rFonts w:ascii="Calibri" w:cs="Calibri" w:eastAsia="Calibri" w:hAnsi="Calibri"/>
+                <w:rFonts w:ascii="Outfit" w:cs="Outfit" w:eastAsia="Outfit" w:hAnsi="Outfit"/>
                 <w:b w:val="false"/>
                 <w:bCs w:val="false"/>
                 <w:sz w:val="18"/>
@@ -2480,7 +2480,7 @@
           <w:p>
             <w:r>
               <w:rPr>
-                <w:rFonts w:ascii="Calibri" w:cs="Calibri" w:eastAsia="Calibri" w:hAnsi="Calibri"/>
+                <w:rFonts w:ascii="Outfit" w:cs="Outfit" w:eastAsia="Outfit" w:hAnsi="Outfit"/>
                 <w:b w:val="false"/>
                 <w:bCs w:val="false"/>
                 <w:sz w:val="18"/>
@@ -2509,7 +2509,7 @@
           <w:p>
             <w:r>
               <w:rPr>
-                <w:rFonts w:ascii="Calibri" w:cs="Calibri" w:eastAsia="Calibri" w:hAnsi="Calibri"/>
+                <w:rFonts w:ascii="Outfit" w:cs="Outfit" w:eastAsia="Outfit" w:hAnsi="Outfit"/>
                 <w:b w:val="false"/>
                 <w:bCs w:val="false"/>
                 <w:sz w:val="18"/>
@@ -2538,7 +2538,7 @@
           <w:p>
             <w:r>
               <w:rPr>
-                <w:rFonts w:ascii="Calibri" w:cs="Calibri" w:eastAsia="Calibri" w:hAnsi="Calibri"/>
+                <w:rFonts w:ascii="Outfit" w:cs="Outfit" w:eastAsia="Outfit" w:hAnsi="Outfit"/>
                 <w:b w:val="false"/>
                 <w:bCs w:val="false"/>
                 <w:sz w:val="18"/>
@@ -2567,7 +2567,7 @@
           <w:p>
             <w:r>
               <w:rPr>
-                <w:rFonts w:ascii="Calibri" w:cs="Calibri" w:eastAsia="Calibri" w:hAnsi="Calibri"/>
+                <w:rFonts w:ascii="Outfit" w:cs="Outfit" w:eastAsia="Outfit" w:hAnsi="Outfit"/>
                 <w:b w:val="false"/>
                 <w:bCs w:val="false"/>
                 <w:sz w:val="18"/>
@@ -2598,7 +2598,7 @@
           <w:p>
             <w:r>
               <w:rPr>
-                <w:rFonts w:ascii="Calibri" w:cs="Calibri" w:eastAsia="Calibri" w:hAnsi="Calibri"/>
+                <w:rFonts w:ascii="Outfit" w:cs="Outfit" w:eastAsia="Outfit" w:hAnsi="Outfit"/>
                 <w:b w:val="false"/>
                 <w:bCs w:val="false"/>
                 <w:sz w:val="18"/>
@@ -2627,7 +2627,7 @@
           <w:p>
             <w:r>
               <w:rPr>
-                <w:rFonts w:ascii="Calibri" w:cs="Calibri" w:eastAsia="Calibri" w:hAnsi="Calibri"/>
+                <w:rFonts w:ascii="Outfit" w:cs="Outfit" w:eastAsia="Outfit" w:hAnsi="Outfit"/>
                 <w:b/>
                 <w:bCs/>
                 <w:sz w:val="18"/>
@@ -2656,7 +2656,7 @@
           <w:p>
             <w:r>
               <w:rPr>
-                <w:rFonts w:ascii="Calibri" w:cs="Calibri" w:eastAsia="Calibri" w:hAnsi="Calibri"/>
+                <w:rFonts w:ascii="Outfit" w:cs="Outfit" w:eastAsia="Outfit" w:hAnsi="Outfit"/>
                 <w:b w:val="false"/>
                 <w:bCs w:val="false"/>
                 <w:sz w:val="18"/>
@@ -2685,7 +2685,7 @@
           <w:p>
             <w:r>
               <w:rPr>
-                <w:rFonts w:ascii="Calibri" w:cs="Calibri" w:eastAsia="Calibri" w:hAnsi="Calibri"/>
+                <w:rFonts w:ascii="Outfit" w:cs="Outfit" w:eastAsia="Outfit" w:hAnsi="Outfit"/>
                 <w:b w:val="false"/>
                 <w:bCs w:val="false"/>
                 <w:sz w:val="18"/>
@@ -2714,7 +2714,7 @@
           <w:p>
             <w:r>
               <w:rPr>
-                <w:rFonts w:ascii="Calibri" w:cs="Calibri" w:eastAsia="Calibri" w:hAnsi="Calibri"/>
+                <w:rFonts w:ascii="Outfit" w:cs="Outfit" w:eastAsia="Outfit" w:hAnsi="Outfit"/>
                 <w:b w:val="false"/>
                 <w:bCs w:val="false"/>
                 <w:sz w:val="18"/>
@@ -2743,7 +2743,7 @@
           <w:p>
             <w:r>
               <w:rPr>
-                <w:rFonts w:ascii="Calibri" w:cs="Calibri" w:eastAsia="Calibri" w:hAnsi="Calibri"/>
+                <w:rFonts w:ascii="Outfit" w:cs="Outfit" w:eastAsia="Outfit" w:hAnsi="Outfit"/>
                 <w:b w:val="false"/>
                 <w:bCs w:val="false"/>
                 <w:sz w:val="18"/>
@@ -2774,7 +2774,7 @@
           <w:p>
             <w:r>
               <w:rPr>
-                <w:rFonts w:ascii="Calibri" w:cs="Calibri" w:eastAsia="Calibri" w:hAnsi="Calibri"/>
+                <w:rFonts w:ascii="Outfit" w:cs="Outfit" w:eastAsia="Outfit" w:hAnsi="Outfit"/>
                 <w:b w:val="false"/>
                 <w:bCs w:val="false"/>
                 <w:sz w:val="18"/>
@@ -2803,7 +2803,7 @@
           <w:p>
             <w:r>
               <w:rPr>
-                <w:rFonts w:ascii="Calibri" w:cs="Calibri" w:eastAsia="Calibri" w:hAnsi="Calibri"/>
+                <w:rFonts w:ascii="Outfit" w:cs="Outfit" w:eastAsia="Outfit" w:hAnsi="Outfit"/>
                 <w:b/>
                 <w:bCs/>
                 <w:sz w:val="18"/>
@@ -2813,7 +2813,7 @@
             </w:r>
             <w:r>
               <w:rPr>
-                <w:rFonts w:ascii="Calibri" w:cs="Calibri" w:eastAsia="Calibri" w:hAnsi="Calibri"/>
+                <w:rFonts w:ascii="Outfit" w:cs="Outfit" w:eastAsia="Outfit" w:hAnsi="Outfit"/>
                 <w:b w:val="false"/>
                 <w:bCs w:val="false"/>
                 <w:sz w:val="18"/>
@@ -2842,7 +2842,7 @@
           <w:p>
             <w:r>
               <w:rPr>
-                <w:rFonts w:ascii="Calibri" w:cs="Calibri" w:eastAsia="Calibri" w:hAnsi="Calibri"/>
+                <w:rFonts w:ascii="Outfit" w:cs="Outfit" w:eastAsia="Outfit" w:hAnsi="Outfit"/>
                 <w:b w:val="false"/>
                 <w:bCs w:val="false"/>
                 <w:sz w:val="18"/>
@@ -2871,7 +2871,7 @@
           <w:p>
             <w:r>
               <w:rPr>
-                <w:rFonts w:ascii="Calibri" w:cs="Calibri" w:eastAsia="Calibri" w:hAnsi="Calibri"/>
+                <w:rFonts w:ascii="Outfit" w:cs="Outfit" w:eastAsia="Outfit" w:hAnsi="Outfit"/>
                 <w:b w:val="false"/>
                 <w:bCs w:val="false"/>
                 <w:sz w:val="18"/>
@@ -2900,7 +2900,7 @@
           <w:p>
             <w:r>
               <w:rPr>
-                <w:rFonts w:ascii="Calibri" w:cs="Calibri" w:eastAsia="Calibri" w:hAnsi="Calibri"/>
+                <w:rFonts w:ascii="Outfit" w:cs="Outfit" w:eastAsia="Outfit" w:hAnsi="Outfit"/>
                 <w:b w:val="false"/>
                 <w:bCs w:val="false"/>
                 <w:sz w:val="18"/>
@@ -2929,7 +2929,7 @@
           <w:p>
             <w:r>
               <w:rPr>
-                <w:rFonts w:ascii="Calibri" w:cs="Calibri" w:eastAsia="Calibri" w:hAnsi="Calibri"/>
+                <w:rFonts w:ascii="Outfit" w:cs="Outfit" w:eastAsia="Outfit" w:hAnsi="Outfit"/>
                 <w:b w:val="false"/>
                 <w:bCs w:val="false"/>
                 <w:sz w:val="18"/>
@@ -2960,7 +2960,7 @@
           <w:p>
             <w:r>
               <w:rPr>
-                <w:rFonts w:ascii="Calibri" w:cs="Calibri" w:eastAsia="Calibri" w:hAnsi="Calibri"/>
+                <w:rFonts w:ascii="Outfit" w:cs="Outfit" w:eastAsia="Outfit" w:hAnsi="Outfit"/>
                 <w:b w:val="false"/>
                 <w:bCs w:val="false"/>
                 <w:sz w:val="18"/>
@@ -2989,7 +2989,7 @@
           <w:p>
             <w:r>
               <w:rPr>
-                <w:rFonts w:ascii="Calibri" w:cs="Calibri" w:eastAsia="Calibri" w:hAnsi="Calibri"/>
+                <w:rFonts w:ascii="Outfit" w:cs="Outfit" w:eastAsia="Outfit" w:hAnsi="Outfit"/>
                 <w:b/>
                 <w:bCs/>
                 <w:sz w:val="18"/>
@@ -3018,7 +3018,7 @@
           <w:p>
             <w:r>
               <w:rPr>
-                <w:rFonts w:ascii="Calibri" w:cs="Calibri" w:eastAsia="Calibri" w:hAnsi="Calibri"/>
+                <w:rFonts w:ascii="Outfit" w:cs="Outfit" w:eastAsia="Outfit" w:hAnsi="Outfit"/>
                 <w:b w:val="false"/>
                 <w:bCs w:val="false"/>
                 <w:sz w:val="18"/>
@@ -3047,7 +3047,7 @@
           <w:p>
             <w:r>
               <w:rPr>
-                <w:rFonts w:ascii="Calibri" w:cs="Calibri" w:eastAsia="Calibri" w:hAnsi="Calibri"/>
+                <w:rFonts w:ascii="Outfit" w:cs="Outfit" w:eastAsia="Outfit" w:hAnsi="Outfit"/>
                 <w:b w:val="false"/>
                 <w:bCs w:val="false"/>
                 <w:sz w:val="18"/>
@@ -3076,7 +3076,7 @@
           <w:p>
             <w:r>
               <w:rPr>
-                <w:rFonts w:ascii="Calibri" w:cs="Calibri" w:eastAsia="Calibri" w:hAnsi="Calibri"/>
+                <w:rFonts w:ascii="Outfit" w:cs="Outfit" w:eastAsia="Outfit" w:hAnsi="Outfit"/>
                 <w:b w:val="false"/>
                 <w:bCs w:val="false"/>
                 <w:sz w:val="18"/>
@@ -3105,7 +3105,7 @@
           <w:p>
             <w:r>
               <w:rPr>
-                <w:rFonts w:ascii="Calibri" w:cs="Calibri" w:eastAsia="Calibri" w:hAnsi="Calibri"/>
+                <w:rFonts w:ascii="Outfit" w:cs="Outfit" w:eastAsia="Outfit" w:hAnsi="Outfit"/>
                 <w:b w:val="false"/>
                 <w:bCs w:val="false"/>
                 <w:sz w:val="18"/>
@@ -3124,7 +3124,7 @@
       </w:pPr>
       <w:r>
         <w:rPr>
-          <w:rFonts w:ascii="Calibri" w:cs="Calibri" w:eastAsia="Calibri" w:hAnsi="Calibri"/>
+          <w:rFonts w:ascii="Outfit" w:cs="Outfit" w:eastAsia="Outfit" w:hAnsi="Outfit"/>
         </w:rPr>
         <w:t xml:space="preserve">C. Partnerzy i grywalizacja</w:t>
       </w:r>
@@ -3172,7 +3172,7 @@
           <w:p>
             <w:r>
               <w:rPr>
-                <w:rFonts w:ascii="Calibri" w:cs="Calibri" w:eastAsia="Calibri" w:hAnsi="Calibri"/>
+                <w:rFonts w:ascii="Outfit" w:cs="Outfit" w:eastAsia="Outfit" w:hAnsi="Outfit"/>
                 <w:b/>
                 <w:bCs/>
                 <w:sz w:val="18"/>
@@ -3202,7 +3202,7 @@
           <w:p>
             <w:r>
               <w:rPr>
-                <w:rFonts w:ascii="Calibri" w:cs="Calibri" w:eastAsia="Calibri" w:hAnsi="Calibri"/>
+                <w:rFonts w:ascii="Outfit" w:cs="Outfit" w:eastAsia="Outfit" w:hAnsi="Outfit"/>
                 <w:b/>
                 <w:bCs/>
                 <w:sz w:val="18"/>
@@ -3232,7 +3232,7 @@
           <w:p>
             <w:r>
               <w:rPr>
-                <w:rFonts w:ascii="Calibri" w:cs="Calibri" w:eastAsia="Calibri" w:hAnsi="Calibri"/>
+                <w:rFonts w:ascii="Outfit" w:cs="Outfit" w:eastAsia="Outfit" w:hAnsi="Outfit"/>
                 <w:b/>
                 <w:bCs/>
                 <w:sz w:val="18"/>
@@ -3262,7 +3262,7 @@
           <w:p>
             <w:r>
               <w:rPr>
-                <w:rFonts w:ascii="Calibri" w:cs="Calibri" w:eastAsia="Calibri" w:hAnsi="Calibri"/>
+                <w:rFonts w:ascii="Outfit" w:cs="Outfit" w:eastAsia="Outfit" w:hAnsi="Outfit"/>
                 <w:b/>
                 <w:bCs/>
                 <w:sz w:val="18"/>
@@ -3292,7 +3292,7 @@
           <w:p>
             <w:r>
               <w:rPr>
-                <w:rFonts w:ascii="Calibri" w:cs="Calibri" w:eastAsia="Calibri" w:hAnsi="Calibri"/>
+                <w:rFonts w:ascii="Outfit" w:cs="Outfit" w:eastAsia="Outfit" w:hAnsi="Outfit"/>
                 <w:b/>
                 <w:bCs/>
                 <w:sz w:val="18"/>
@@ -3323,7 +3323,7 @@
           <w:p>
             <w:r>
               <w:rPr>
-                <w:rFonts w:ascii="Calibri" w:cs="Calibri" w:eastAsia="Calibri" w:hAnsi="Calibri"/>
+                <w:rFonts w:ascii="Outfit" w:cs="Outfit" w:eastAsia="Outfit" w:hAnsi="Outfit"/>
                 <w:b w:val="false"/>
                 <w:bCs w:val="false"/>
                 <w:sz w:val="18"/>
@@ -3352,7 +3352,7 @@
           <w:p>
             <w:r>
               <w:rPr>
-                <w:rFonts w:ascii="Calibri" w:cs="Calibri" w:eastAsia="Calibri" w:hAnsi="Calibri"/>
+                <w:rFonts w:ascii="Outfit" w:cs="Outfit" w:eastAsia="Outfit" w:hAnsi="Outfit"/>
                 <w:b/>
                 <w:bCs/>
                 <w:sz w:val="18"/>
@@ -3362,7 +3362,7 @@
             </w:r>
             <w:r>
               <w:rPr>
-                <w:rFonts w:ascii="Calibri" w:cs="Calibri" w:eastAsia="Calibri" w:hAnsi="Calibri"/>
+                <w:rFonts w:ascii="Outfit" w:cs="Outfit" w:eastAsia="Outfit" w:hAnsi="Outfit"/>
                 <w:b w:val="false"/>
                 <w:bCs w:val="false"/>
                 <w:sz w:val="18"/>
@@ -3391,7 +3391,7 @@
           <w:p>
             <w:r>
               <w:rPr>
-                <w:rFonts w:ascii="Calibri" w:cs="Calibri" w:eastAsia="Calibri" w:hAnsi="Calibri"/>
+                <w:rFonts w:ascii="Outfit" w:cs="Outfit" w:eastAsia="Outfit" w:hAnsi="Outfit"/>
                 <w:b w:val="false"/>
                 <w:bCs w:val="false"/>
                 <w:sz w:val="18"/>
@@ -3420,7 +3420,7 @@
           <w:p>
             <w:r>
               <w:rPr>
-                <w:rFonts w:ascii="Calibri" w:cs="Calibri" w:eastAsia="Calibri" w:hAnsi="Calibri"/>
+                <w:rFonts w:ascii="Outfit" w:cs="Outfit" w:eastAsia="Outfit" w:hAnsi="Outfit"/>
                 <w:b w:val="false"/>
                 <w:bCs w:val="false"/>
                 <w:sz w:val="18"/>
@@ -3449,7 +3449,7 @@
           <w:p>
             <w:r>
               <w:rPr>
-                <w:rFonts w:ascii="Calibri" w:cs="Calibri" w:eastAsia="Calibri" w:hAnsi="Calibri"/>
+                <w:rFonts w:ascii="Outfit" w:cs="Outfit" w:eastAsia="Outfit" w:hAnsi="Outfit"/>
                 <w:b w:val="false"/>
                 <w:bCs w:val="false"/>
                 <w:sz w:val="18"/>
@@ -3480,7 +3480,7 @@
           <w:p>
             <w:r>
               <w:rPr>
-                <w:rFonts w:ascii="Calibri" w:cs="Calibri" w:eastAsia="Calibri" w:hAnsi="Calibri"/>
+                <w:rFonts w:ascii="Outfit" w:cs="Outfit" w:eastAsia="Outfit" w:hAnsi="Outfit"/>
                 <w:b w:val="false"/>
                 <w:bCs w:val="false"/>
                 <w:sz w:val="18"/>
@@ -3509,7 +3509,7 @@
           <w:p>
             <w:r>
               <w:rPr>
-                <w:rFonts w:ascii="Calibri" w:cs="Calibri" w:eastAsia="Calibri" w:hAnsi="Calibri"/>
+                <w:rFonts w:ascii="Outfit" w:cs="Outfit" w:eastAsia="Outfit" w:hAnsi="Outfit"/>
                 <w:b/>
                 <w:bCs/>
                 <w:sz w:val="18"/>
@@ -3519,7 +3519,7 @@
             </w:r>
             <w:r>
               <w:rPr>
-                <w:rFonts w:ascii="Calibri" w:cs="Calibri" w:eastAsia="Calibri" w:hAnsi="Calibri"/>
+                <w:rFonts w:ascii="Outfit" w:cs="Outfit" w:eastAsia="Outfit" w:hAnsi="Outfit"/>
                 <w:b w:val="false"/>
                 <w:bCs w:val="false"/>
                 <w:sz w:val="18"/>
@@ -3548,7 +3548,7 @@
           <w:p>
             <w:r>
               <w:rPr>
-                <w:rFonts w:ascii="Calibri" w:cs="Calibri" w:eastAsia="Calibri" w:hAnsi="Calibri"/>
+                <w:rFonts w:ascii="Outfit" w:cs="Outfit" w:eastAsia="Outfit" w:hAnsi="Outfit"/>
                 <w:b w:val="false"/>
                 <w:bCs w:val="false"/>
                 <w:sz w:val="18"/>
@@ -3577,7 +3577,7 @@
           <w:p>
             <w:r>
               <w:rPr>
-                <w:rFonts w:ascii="Calibri" w:cs="Calibri" w:eastAsia="Calibri" w:hAnsi="Calibri"/>
+                <w:rFonts w:ascii="Outfit" w:cs="Outfit" w:eastAsia="Outfit" w:hAnsi="Outfit"/>
                 <w:b w:val="false"/>
                 <w:bCs w:val="false"/>
                 <w:sz w:val="18"/>
@@ -3606,7 +3606,7 @@
           <w:p>
             <w:r>
               <w:rPr>
-                <w:rFonts w:ascii="Calibri" w:cs="Calibri" w:eastAsia="Calibri" w:hAnsi="Calibri"/>
+                <w:rFonts w:ascii="Outfit" w:cs="Outfit" w:eastAsia="Outfit" w:hAnsi="Outfit"/>
                 <w:b w:val="false"/>
                 <w:bCs w:val="false"/>
                 <w:sz w:val="18"/>
@@ -3625,7 +3625,7 @@
       </w:pPr>
       <w:r>
         <w:rPr>
-          <w:rFonts w:ascii="Calibri" w:cs="Calibri" w:eastAsia="Calibri" w:hAnsi="Calibri"/>
+          <w:rFonts w:ascii="Outfit" w:cs="Outfit" w:eastAsia="Outfit" w:hAnsi="Outfit"/>
         </w:rPr>
         <w:t xml:space="preserve">Już działa z publicznych źródeł (nic nie trzeba zamawiać)</w:t>
       </w:r>
@@ -3641,7 +3641,7 @@
       </w:pPr>
       <w:r>
         <w:rPr>
-          <w:rFonts w:ascii="Calibri" w:cs="Calibri" w:eastAsia="Calibri" w:hAnsi="Calibri"/>
+          <w:rFonts w:ascii="Outfit" w:cs="Outfit" w:eastAsia="Outfit" w:hAnsi="Outfit"/>
           <w:sz w:val="22"/>
           <w:szCs w:val="22"/>
         </w:rPr>
@@ -3659,7 +3659,7 @@
       </w:pPr>
       <w:r>
         <w:rPr>
-          <w:rFonts w:ascii="Calibri" w:cs="Calibri" w:eastAsia="Calibri" w:hAnsi="Calibri"/>
+          <w:rFonts w:ascii="Outfit" w:cs="Outfit" w:eastAsia="Outfit" w:hAnsi="Outfit"/>
           <w:sz w:val="22"/>
           <w:szCs w:val="22"/>
         </w:rPr>
@@ -3677,7 +3677,7 @@
       </w:pPr>
       <w:r>
         <w:rPr>
-          <w:rFonts w:ascii="Calibri" w:cs="Calibri" w:eastAsia="Calibri" w:hAnsi="Calibri"/>
+          <w:rFonts w:ascii="Outfit" w:cs="Outfit" w:eastAsia="Outfit" w:hAnsi="Outfit"/>
           <w:sz w:val="22"/>
           <w:szCs w:val="22"/>
         </w:rPr>
@@ -3695,7 +3695,7 @@
       </w:pPr>
       <w:r>
         <w:rPr>
-          <w:rFonts w:ascii="Calibri" w:cs="Calibri" w:eastAsia="Calibri" w:hAnsi="Calibri"/>
+          <w:rFonts w:ascii="Outfit" w:cs="Outfit" w:eastAsia="Outfit" w:hAnsi="Outfit"/>
           <w:sz w:val="22"/>
           <w:szCs w:val="22"/>
         </w:rPr>
@@ -3709,7 +3709,7 @@
       </w:pPr>
       <w:r>
         <w:rPr>
-          <w:rFonts w:ascii="Calibri" w:cs="Calibri" w:eastAsia="Calibri" w:hAnsi="Calibri"/>
+          <w:rFonts w:ascii="Outfit" w:cs="Outfit" w:eastAsia="Outfit" w:hAnsi="Outfit"/>
         </w:rPr>
         <w:t xml:space="preserve">Kolejność</w:t>
       </w:r>
@@ -3720,7 +3720,7 @@
       </w:pPr>
       <w:r>
         <w:rPr>
-          <w:rFonts w:ascii="Calibri" w:cs="Calibri" w:eastAsia="Calibri" w:hAnsi="Calibri"/>
+          <w:rFonts w:ascii="Outfit" w:cs="Outfit" w:eastAsia="Outfit" w:hAnsi="Outfit"/>
           <w:sz w:val="22"/>
           <w:szCs w:val="22"/>
         </w:rPr>
@@ -3933,7 +3933,7 @@
   <w:docDefaults>
     <w:rPrDefault>
       <w:rPr>
-        <w:rFonts w:ascii="Calibri" w:cs="Calibri" w:eastAsia="Calibri" w:hAnsi="Calibri"/>
+        <w:rFonts w:ascii="Outfit" w:cs="Outfit" w:eastAsia="Outfit" w:hAnsi="Outfit"/>
       </w:rPr>
     </w:rPrDefault>
     <w:pPrDefault/>

</xml_diff>

<commit_message>
docs: data scope document in the Outfit font (#71)
Claude-Session: https://claude.ai/code/session_01DNGRWUZD1xLZ8KwwBcRF5A

Co-authored-by: Claude <noreply@anthropic.com>
</commit_message>
<xml_diff>
--- a/docs/Cool_Lodz_zakres_danych.docx
+++ b/docs/Cool_Lodz_zakres_danych.docx
@@ -9,7 +9,7 @@
       </w:pPr>
       <w:r>
         <w:rPr>
-          <w:rFonts w:ascii="Calibri" w:cs="Calibri" w:eastAsia="Calibri" w:hAnsi="Calibri"/>
+          <w:rFonts w:ascii="Outfit" w:cs="Outfit" w:eastAsia="Outfit" w:hAnsi="Outfit"/>
         </w:rPr>
         <w:t xml:space="preserve">Cool Łódź: zakres danych potrzebnych do aplikacji</w:t>
       </w:r>
@@ -20,7 +20,7 @@
       </w:pPr>
       <w:r>
         <w:rPr>
-          <w:rFonts w:ascii="Calibri" w:cs="Calibri" w:eastAsia="Calibri" w:hAnsi="Calibri"/>
+          <w:rFonts w:ascii="Outfit" w:cs="Outfit" w:eastAsia="Outfit" w:hAnsi="Outfit"/>
           <w:sz w:val="22"/>
           <w:szCs w:val="22"/>
         </w:rPr>
@@ -34,7 +34,7 @@
       </w:pPr>
       <w:r>
         <w:rPr>
-          <w:rFonts w:ascii="Calibri" w:cs="Calibri" w:eastAsia="Calibri" w:hAnsi="Calibri"/>
+          <w:rFonts w:ascii="Outfit" w:cs="Outfit" w:eastAsia="Outfit" w:hAnsi="Outfit"/>
         </w:rPr>
         <w:t xml:space="preserve">Wspólne zasady dla wszystkich plików</w:t>
       </w:r>
@@ -50,7 +50,7 @@
       </w:pPr>
       <w:r>
         <w:rPr>
-          <w:rFonts w:ascii="Calibri" w:cs="Calibri" w:eastAsia="Calibri" w:hAnsi="Calibri"/>
+          <w:rFonts w:ascii="Outfit" w:cs="Outfit" w:eastAsia="Outfit" w:hAnsi="Outfit"/>
           <w:sz w:val="22"/>
           <w:szCs w:val="22"/>
         </w:rPr>
@@ -68,7 +68,7 @@
       </w:pPr>
       <w:r>
         <w:rPr>
-          <w:rFonts w:ascii="Calibri" w:cs="Calibri" w:eastAsia="Calibri" w:hAnsi="Calibri"/>
+          <w:rFonts w:ascii="Outfit" w:cs="Outfit" w:eastAsia="Outfit" w:hAnsi="Outfit"/>
           <w:sz w:val="22"/>
           <w:szCs w:val="22"/>
         </w:rPr>
@@ -86,7 +86,7 @@
       </w:pPr>
       <w:r>
         <w:rPr>
-          <w:rFonts w:ascii="Calibri" w:cs="Calibri" w:eastAsia="Calibri" w:hAnsi="Calibri"/>
+          <w:rFonts w:ascii="Outfit" w:cs="Outfit" w:eastAsia="Outfit" w:hAnsi="Outfit"/>
           <w:sz w:val="22"/>
           <w:szCs w:val="22"/>
         </w:rPr>
@@ -104,7 +104,7 @@
       </w:pPr>
       <w:r>
         <w:rPr>
-          <w:rFonts w:ascii="Calibri" w:cs="Calibri" w:eastAsia="Calibri" w:hAnsi="Calibri"/>
+          <w:rFonts w:ascii="Outfit" w:cs="Outfit" w:eastAsia="Outfit" w:hAnsi="Outfit"/>
           <w:sz w:val="22"/>
           <w:szCs w:val="22"/>
         </w:rPr>
@@ -122,7 +122,7 @@
       </w:pPr>
       <w:r>
         <w:rPr>
-          <w:rFonts w:ascii="Calibri" w:cs="Calibri" w:eastAsia="Calibri" w:hAnsi="Calibri"/>
+          <w:rFonts w:ascii="Outfit" w:cs="Outfit" w:eastAsia="Outfit" w:hAnsi="Outfit"/>
           <w:sz w:val="22"/>
           <w:szCs w:val="22"/>
         </w:rPr>
@@ -140,7 +140,7 @@
       </w:pPr>
       <w:r>
         <w:rPr>
-          <w:rFonts w:ascii="Calibri" w:cs="Calibri" w:eastAsia="Calibri" w:hAnsi="Calibri"/>
+          <w:rFonts w:ascii="Outfit" w:cs="Outfit" w:eastAsia="Outfit" w:hAnsi="Outfit"/>
           <w:sz w:val="22"/>
           <w:szCs w:val="22"/>
         </w:rPr>
@@ -154,7 +154,7 @@
       </w:pPr>
       <w:r>
         <w:rPr>
-          <w:rFonts w:ascii="Calibri" w:cs="Calibri" w:eastAsia="Calibri" w:hAnsi="Calibri"/>
+          <w:rFonts w:ascii="Outfit" w:cs="Outfit" w:eastAsia="Outfit" w:hAnsi="Outfit"/>
         </w:rPr>
         <w:t xml:space="preserve">A. Niezbędne (bez nich nie ma prawdziwej aplikacji)</w:t>
       </w:r>
@@ -203,7 +203,7 @@
           <w:p>
             <w:r>
               <w:rPr>
-                <w:rFonts w:ascii="Calibri" w:cs="Calibri" w:eastAsia="Calibri" w:hAnsi="Calibri"/>
+                <w:rFonts w:ascii="Outfit" w:cs="Outfit" w:eastAsia="Outfit" w:hAnsi="Outfit"/>
                 <w:b/>
                 <w:bCs/>
                 <w:sz w:val="18"/>
@@ -233,7 +233,7 @@
           <w:p>
             <w:r>
               <w:rPr>
-                <w:rFonts w:ascii="Calibri" w:cs="Calibri" w:eastAsia="Calibri" w:hAnsi="Calibri"/>
+                <w:rFonts w:ascii="Outfit" w:cs="Outfit" w:eastAsia="Outfit" w:hAnsi="Outfit"/>
                 <w:b/>
                 <w:bCs/>
                 <w:sz w:val="18"/>
@@ -263,7 +263,7 @@
           <w:p>
             <w:r>
               <w:rPr>
-                <w:rFonts w:ascii="Calibri" w:cs="Calibri" w:eastAsia="Calibri" w:hAnsi="Calibri"/>
+                <w:rFonts w:ascii="Outfit" w:cs="Outfit" w:eastAsia="Outfit" w:hAnsi="Outfit"/>
                 <w:b/>
                 <w:bCs/>
                 <w:sz w:val="18"/>
@@ -293,7 +293,7 @@
           <w:p>
             <w:r>
               <w:rPr>
-                <w:rFonts w:ascii="Calibri" w:cs="Calibri" w:eastAsia="Calibri" w:hAnsi="Calibri"/>
+                <w:rFonts w:ascii="Outfit" w:cs="Outfit" w:eastAsia="Outfit" w:hAnsi="Outfit"/>
                 <w:b/>
                 <w:bCs/>
                 <w:sz w:val="18"/>
@@ -323,7 +323,7 @@
           <w:p>
             <w:r>
               <w:rPr>
-                <w:rFonts w:ascii="Calibri" w:cs="Calibri" w:eastAsia="Calibri" w:hAnsi="Calibri"/>
+                <w:rFonts w:ascii="Outfit" w:cs="Outfit" w:eastAsia="Outfit" w:hAnsi="Outfit"/>
                 <w:b/>
                 <w:bCs/>
                 <w:sz w:val="18"/>
@@ -353,7 +353,7 @@
           <w:p>
             <w:r>
               <w:rPr>
-                <w:rFonts w:ascii="Calibri" w:cs="Calibri" w:eastAsia="Calibri" w:hAnsi="Calibri"/>
+                <w:rFonts w:ascii="Outfit" w:cs="Outfit" w:eastAsia="Outfit" w:hAnsi="Outfit"/>
                 <w:b/>
                 <w:bCs/>
                 <w:sz w:val="18"/>
@@ -384,7 +384,7 @@
           <w:p>
             <w:r>
               <w:rPr>
-                <w:rFonts w:ascii="Calibri" w:cs="Calibri" w:eastAsia="Calibri" w:hAnsi="Calibri"/>
+                <w:rFonts w:ascii="Outfit" w:cs="Outfit" w:eastAsia="Outfit" w:hAnsi="Outfit"/>
                 <w:b w:val="false"/>
                 <w:bCs w:val="false"/>
                 <w:sz w:val="18"/>
@@ -413,7 +413,7 @@
           <w:p>
             <w:r>
               <w:rPr>
-                <w:rFonts w:ascii="Calibri" w:cs="Calibri" w:eastAsia="Calibri" w:hAnsi="Calibri"/>
+                <w:rFonts w:ascii="Outfit" w:cs="Outfit" w:eastAsia="Outfit" w:hAnsi="Outfit"/>
                 <w:b/>
                 <w:bCs/>
                 <w:sz w:val="18"/>
@@ -423,7 +423,7 @@
             </w:r>
             <w:r>
               <w:rPr>
-                <w:rFonts w:ascii="Calibri" w:cs="Calibri" w:eastAsia="Calibri" w:hAnsi="Calibri"/>
+                <w:rFonts w:ascii="Outfit" w:cs="Outfit" w:eastAsia="Outfit" w:hAnsi="Outfit"/>
                 <w:b w:val="false"/>
                 <w:bCs w:val="false"/>
                 <w:sz w:val="18"/>
@@ -452,7 +452,7 @@
           <w:p>
             <w:r>
               <w:rPr>
-                <w:rFonts w:ascii="Calibri" w:cs="Calibri" w:eastAsia="Calibri" w:hAnsi="Calibri"/>
+                <w:rFonts w:ascii="Outfit" w:cs="Outfit" w:eastAsia="Outfit" w:hAnsi="Outfit"/>
                 <w:b w:val="false"/>
                 <w:bCs w:val="false"/>
                 <w:sz w:val="18"/>
@@ -481,7 +481,7 @@
           <w:p>
             <w:r>
               <w:rPr>
-                <w:rFonts w:ascii="Calibri" w:cs="Calibri" w:eastAsia="Calibri" w:hAnsi="Calibri"/>
+                <w:rFonts w:ascii="Outfit" w:cs="Outfit" w:eastAsia="Outfit" w:hAnsi="Outfit"/>
                 <w:b w:val="false"/>
                 <w:bCs w:val="false"/>
                 <w:sz w:val="18"/>
@@ -510,7 +510,7 @@
           <w:p>
             <w:r>
               <w:rPr>
-                <w:rFonts w:ascii="Calibri" w:cs="Calibri" w:eastAsia="Calibri" w:hAnsi="Calibri"/>
+                <w:rFonts w:ascii="Outfit" w:cs="Outfit" w:eastAsia="Outfit" w:hAnsi="Outfit"/>
                 <w:b w:val="false"/>
                 <w:bCs w:val="false"/>
                 <w:sz w:val="18"/>
@@ -539,7 +539,7 @@
           <w:p>
             <w:r>
               <w:rPr>
-                <w:rFonts w:ascii="Calibri" w:cs="Calibri" w:eastAsia="Calibri" w:hAnsi="Calibri"/>
+                <w:rFonts w:ascii="Outfit" w:cs="Outfit" w:eastAsia="Outfit" w:hAnsi="Outfit"/>
                 <w:b w:val="false"/>
                 <w:bCs w:val="false"/>
                 <w:sz w:val="18"/>
@@ -570,7 +570,7 @@
           <w:p>
             <w:r>
               <w:rPr>
-                <w:rFonts w:ascii="Calibri" w:cs="Calibri" w:eastAsia="Calibri" w:hAnsi="Calibri"/>
+                <w:rFonts w:ascii="Outfit" w:cs="Outfit" w:eastAsia="Outfit" w:hAnsi="Outfit"/>
                 <w:b w:val="false"/>
                 <w:bCs w:val="false"/>
                 <w:sz w:val="18"/>
@@ -599,7 +599,7 @@
           <w:p>
             <w:r>
               <w:rPr>
-                <w:rFonts w:ascii="Calibri" w:cs="Calibri" w:eastAsia="Calibri" w:hAnsi="Calibri"/>
+                <w:rFonts w:ascii="Outfit" w:cs="Outfit" w:eastAsia="Outfit" w:hAnsi="Outfit"/>
                 <w:b/>
                 <w:bCs/>
                 <w:sz w:val="18"/>
@@ -628,7 +628,7 @@
           <w:p>
             <w:r>
               <w:rPr>
-                <w:rFonts w:ascii="Calibri" w:cs="Calibri" w:eastAsia="Calibri" w:hAnsi="Calibri"/>
+                <w:rFonts w:ascii="Outfit" w:cs="Outfit" w:eastAsia="Outfit" w:hAnsi="Outfit"/>
                 <w:b w:val="false"/>
                 <w:bCs w:val="false"/>
                 <w:sz w:val="18"/>
@@ -657,7 +657,7 @@
           <w:p>
             <w:r>
               <w:rPr>
-                <w:rFonts w:ascii="Calibri" w:cs="Calibri" w:eastAsia="Calibri" w:hAnsi="Calibri"/>
+                <w:rFonts w:ascii="Outfit" w:cs="Outfit" w:eastAsia="Outfit" w:hAnsi="Outfit"/>
                 <w:b w:val="false"/>
                 <w:bCs w:val="false"/>
                 <w:sz w:val="18"/>
@@ -686,7 +686,7 @@
           <w:p>
             <w:r>
               <w:rPr>
-                <w:rFonts w:ascii="Calibri" w:cs="Calibri" w:eastAsia="Calibri" w:hAnsi="Calibri"/>
+                <w:rFonts w:ascii="Outfit" w:cs="Outfit" w:eastAsia="Outfit" w:hAnsi="Outfit"/>
                 <w:b w:val="false"/>
                 <w:bCs w:val="false"/>
                 <w:sz w:val="18"/>
@@ -715,7 +715,7 @@
           <w:p>
             <w:r>
               <w:rPr>
-                <w:rFonts w:ascii="Calibri" w:cs="Calibri" w:eastAsia="Calibri" w:hAnsi="Calibri"/>
+                <w:rFonts w:ascii="Outfit" w:cs="Outfit" w:eastAsia="Outfit" w:hAnsi="Outfit"/>
                 <w:b w:val="false"/>
                 <w:bCs w:val="false"/>
                 <w:sz w:val="18"/>
@@ -746,7 +746,7 @@
           <w:p>
             <w:r>
               <w:rPr>
-                <w:rFonts w:ascii="Calibri" w:cs="Calibri" w:eastAsia="Calibri" w:hAnsi="Calibri"/>
+                <w:rFonts w:ascii="Outfit" w:cs="Outfit" w:eastAsia="Outfit" w:hAnsi="Outfit"/>
                 <w:b w:val="false"/>
                 <w:bCs w:val="false"/>
                 <w:sz w:val="18"/>
@@ -775,7 +775,7 @@
           <w:p>
             <w:r>
               <w:rPr>
-                <w:rFonts w:ascii="Calibri" w:cs="Calibri" w:eastAsia="Calibri" w:hAnsi="Calibri"/>
+                <w:rFonts w:ascii="Outfit" w:cs="Outfit" w:eastAsia="Outfit" w:hAnsi="Outfit"/>
                 <w:b/>
                 <w:bCs/>
                 <w:sz w:val="18"/>
@@ -785,7 +785,7 @@
             </w:r>
             <w:r>
               <w:rPr>
-                <w:rFonts w:ascii="Calibri" w:cs="Calibri" w:eastAsia="Calibri" w:hAnsi="Calibri"/>
+                <w:rFonts w:ascii="Outfit" w:cs="Outfit" w:eastAsia="Outfit" w:hAnsi="Outfit"/>
                 <w:b w:val="false"/>
                 <w:bCs w:val="false"/>
                 <w:sz w:val="18"/>
@@ -814,7 +814,7 @@
           <w:p>
             <w:r>
               <w:rPr>
-                <w:rFonts w:ascii="Calibri" w:cs="Calibri" w:eastAsia="Calibri" w:hAnsi="Calibri"/>
+                <w:rFonts w:ascii="Outfit" w:cs="Outfit" w:eastAsia="Outfit" w:hAnsi="Outfit"/>
                 <w:b w:val="false"/>
                 <w:bCs w:val="false"/>
                 <w:sz w:val="18"/>
@@ -843,7 +843,7 @@
           <w:p>
             <w:r>
               <w:rPr>
-                <w:rFonts w:ascii="Calibri" w:cs="Calibri" w:eastAsia="Calibri" w:hAnsi="Calibri"/>
+                <w:rFonts w:ascii="Outfit" w:cs="Outfit" w:eastAsia="Outfit" w:hAnsi="Outfit"/>
                 <w:b w:val="false"/>
                 <w:bCs w:val="false"/>
                 <w:sz w:val="18"/>
@@ -872,7 +872,7 @@
           <w:p>
             <w:r>
               <w:rPr>
-                <w:rFonts w:ascii="Calibri" w:cs="Calibri" w:eastAsia="Calibri" w:hAnsi="Calibri"/>
+                <w:rFonts w:ascii="Outfit" w:cs="Outfit" w:eastAsia="Outfit" w:hAnsi="Outfit"/>
                 <w:b w:val="false"/>
                 <w:bCs w:val="false"/>
                 <w:sz w:val="18"/>
@@ -901,7 +901,7 @@
           <w:p>
             <w:r>
               <w:rPr>
-                <w:rFonts w:ascii="Calibri" w:cs="Calibri" w:eastAsia="Calibri" w:hAnsi="Calibri"/>
+                <w:rFonts w:ascii="Outfit" w:cs="Outfit" w:eastAsia="Outfit" w:hAnsi="Outfit"/>
                 <w:b w:val="false"/>
                 <w:bCs w:val="false"/>
                 <w:sz w:val="18"/>
@@ -932,7 +932,7 @@
           <w:p>
             <w:r>
               <w:rPr>
-                <w:rFonts w:ascii="Calibri" w:cs="Calibri" w:eastAsia="Calibri" w:hAnsi="Calibri"/>
+                <w:rFonts w:ascii="Outfit" w:cs="Outfit" w:eastAsia="Outfit" w:hAnsi="Outfit"/>
                 <w:b w:val="false"/>
                 <w:bCs w:val="false"/>
                 <w:sz w:val="18"/>
@@ -961,7 +961,7 @@
           <w:p>
             <w:r>
               <w:rPr>
-                <w:rFonts w:ascii="Calibri" w:cs="Calibri" w:eastAsia="Calibri" w:hAnsi="Calibri"/>
+                <w:rFonts w:ascii="Outfit" w:cs="Outfit" w:eastAsia="Outfit" w:hAnsi="Outfit"/>
                 <w:b/>
                 <w:bCs/>
                 <w:sz w:val="18"/>
@@ -971,7 +971,7 @@
             </w:r>
             <w:r>
               <w:rPr>
-                <w:rFonts w:ascii="Calibri" w:cs="Calibri" w:eastAsia="Calibri" w:hAnsi="Calibri"/>
+                <w:rFonts w:ascii="Outfit" w:cs="Outfit" w:eastAsia="Outfit" w:hAnsi="Outfit"/>
                 <w:b w:val="false"/>
                 <w:bCs w:val="false"/>
                 <w:sz w:val="18"/>
@@ -1000,7 +1000,7 @@
           <w:p>
             <w:r>
               <w:rPr>
-                <w:rFonts w:ascii="Calibri" w:cs="Calibri" w:eastAsia="Calibri" w:hAnsi="Calibri"/>
+                <w:rFonts w:ascii="Outfit" w:cs="Outfit" w:eastAsia="Outfit" w:hAnsi="Outfit"/>
                 <w:b w:val="false"/>
                 <w:bCs w:val="false"/>
                 <w:sz w:val="18"/>
@@ -1029,7 +1029,7 @@
           <w:p>
             <w:r>
               <w:rPr>
-                <w:rFonts w:ascii="Calibri" w:cs="Calibri" w:eastAsia="Calibri" w:hAnsi="Calibri"/>
+                <w:rFonts w:ascii="Outfit" w:cs="Outfit" w:eastAsia="Outfit" w:hAnsi="Outfit"/>
                 <w:b w:val="false"/>
                 <w:bCs w:val="false"/>
                 <w:sz w:val="18"/>
@@ -1058,7 +1058,7 @@
           <w:p>
             <w:r>
               <w:rPr>
-                <w:rFonts w:ascii="Calibri" w:cs="Calibri" w:eastAsia="Calibri" w:hAnsi="Calibri"/>
+                <w:rFonts w:ascii="Outfit" w:cs="Outfit" w:eastAsia="Outfit" w:hAnsi="Outfit"/>
                 <w:b w:val="false"/>
                 <w:bCs w:val="false"/>
                 <w:sz w:val="18"/>
@@ -1087,7 +1087,7 @@
           <w:p>
             <w:r>
               <w:rPr>
-                <w:rFonts w:ascii="Calibri" w:cs="Calibri" w:eastAsia="Calibri" w:hAnsi="Calibri"/>
+                <w:rFonts w:ascii="Outfit" w:cs="Outfit" w:eastAsia="Outfit" w:hAnsi="Outfit"/>
                 <w:b w:val="false"/>
                 <w:bCs w:val="false"/>
                 <w:sz w:val="18"/>
@@ -1118,7 +1118,7 @@
           <w:p>
             <w:r>
               <w:rPr>
-                <w:rFonts w:ascii="Calibri" w:cs="Calibri" w:eastAsia="Calibri" w:hAnsi="Calibri"/>
+                <w:rFonts w:ascii="Outfit" w:cs="Outfit" w:eastAsia="Outfit" w:hAnsi="Outfit"/>
                 <w:b w:val="false"/>
                 <w:bCs w:val="false"/>
                 <w:sz w:val="18"/>
@@ -1147,7 +1147,7 @@
           <w:p>
             <w:r>
               <w:rPr>
-                <w:rFonts w:ascii="Calibri" w:cs="Calibri" w:eastAsia="Calibri" w:hAnsi="Calibri"/>
+                <w:rFonts w:ascii="Outfit" w:cs="Outfit" w:eastAsia="Outfit" w:hAnsi="Outfit"/>
                 <w:b/>
                 <w:bCs/>
                 <w:sz w:val="18"/>
@@ -1176,7 +1176,7 @@
           <w:p>
             <w:r>
               <w:rPr>
-                <w:rFonts w:ascii="Calibri" w:cs="Calibri" w:eastAsia="Calibri" w:hAnsi="Calibri"/>
+                <w:rFonts w:ascii="Outfit" w:cs="Outfit" w:eastAsia="Outfit" w:hAnsi="Outfit"/>
                 <w:b w:val="false"/>
                 <w:bCs w:val="false"/>
                 <w:sz w:val="18"/>
@@ -1205,7 +1205,7 @@
           <w:p>
             <w:r>
               <w:rPr>
-                <w:rFonts w:ascii="Calibri" w:cs="Calibri" w:eastAsia="Calibri" w:hAnsi="Calibri"/>
+                <w:rFonts w:ascii="Outfit" w:cs="Outfit" w:eastAsia="Outfit" w:hAnsi="Outfit"/>
                 <w:b w:val="false"/>
                 <w:bCs w:val="false"/>
                 <w:sz w:val="18"/>
@@ -1234,7 +1234,7 @@
           <w:p>
             <w:r>
               <w:rPr>
-                <w:rFonts w:ascii="Calibri" w:cs="Calibri" w:eastAsia="Calibri" w:hAnsi="Calibri"/>
+                <w:rFonts w:ascii="Outfit" w:cs="Outfit" w:eastAsia="Outfit" w:hAnsi="Outfit"/>
                 <w:b w:val="false"/>
                 <w:bCs w:val="false"/>
                 <w:sz w:val="18"/>
@@ -1263,7 +1263,7 @@
           <w:p>
             <w:r>
               <w:rPr>
-                <w:rFonts w:ascii="Calibri" w:cs="Calibri" w:eastAsia="Calibri" w:hAnsi="Calibri"/>
+                <w:rFonts w:ascii="Outfit" w:cs="Outfit" w:eastAsia="Outfit" w:hAnsi="Outfit"/>
                 <w:b w:val="false"/>
                 <w:bCs w:val="false"/>
                 <w:sz w:val="18"/>
@@ -1294,7 +1294,7 @@
           <w:p>
             <w:r>
               <w:rPr>
-                <w:rFonts w:ascii="Calibri" w:cs="Calibri" w:eastAsia="Calibri" w:hAnsi="Calibri"/>
+                <w:rFonts w:ascii="Outfit" w:cs="Outfit" w:eastAsia="Outfit" w:hAnsi="Outfit"/>
                 <w:b w:val="false"/>
                 <w:bCs w:val="false"/>
                 <w:sz w:val="18"/>
@@ -1323,7 +1323,7 @@
           <w:p>
             <w:r>
               <w:rPr>
-                <w:rFonts w:ascii="Calibri" w:cs="Calibri" w:eastAsia="Calibri" w:hAnsi="Calibri"/>
+                <w:rFonts w:ascii="Outfit" w:cs="Outfit" w:eastAsia="Outfit" w:hAnsi="Outfit"/>
                 <w:b/>
                 <w:bCs/>
                 <w:sz w:val="18"/>
@@ -1352,7 +1352,7 @@
           <w:p>
             <w:r>
               <w:rPr>
-                <w:rFonts w:ascii="Calibri" w:cs="Calibri" w:eastAsia="Calibri" w:hAnsi="Calibri"/>
+                <w:rFonts w:ascii="Outfit" w:cs="Outfit" w:eastAsia="Outfit" w:hAnsi="Outfit"/>
                 <w:b w:val="false"/>
                 <w:bCs w:val="false"/>
                 <w:sz w:val="18"/>
@@ -1381,7 +1381,7 @@
           <w:p>
             <w:r>
               <w:rPr>
-                <w:rFonts w:ascii="Calibri" w:cs="Calibri" w:eastAsia="Calibri" w:hAnsi="Calibri"/>
+                <w:rFonts w:ascii="Outfit" w:cs="Outfit" w:eastAsia="Outfit" w:hAnsi="Outfit"/>
                 <w:b w:val="false"/>
                 <w:bCs w:val="false"/>
                 <w:sz w:val="18"/>
@@ -1410,7 +1410,7 @@
           <w:p>
             <w:r>
               <w:rPr>
-                <w:rFonts w:ascii="Calibri" w:cs="Calibri" w:eastAsia="Calibri" w:hAnsi="Calibri"/>
+                <w:rFonts w:ascii="Outfit" w:cs="Outfit" w:eastAsia="Outfit" w:hAnsi="Outfit"/>
                 <w:b w:val="false"/>
                 <w:bCs w:val="false"/>
                 <w:sz w:val="18"/>
@@ -1439,7 +1439,7 @@
           <w:p>
             <w:r>
               <w:rPr>
-                <w:rFonts w:ascii="Calibri" w:cs="Calibri" w:eastAsia="Calibri" w:hAnsi="Calibri"/>
+                <w:rFonts w:ascii="Outfit" w:cs="Outfit" w:eastAsia="Outfit" w:hAnsi="Outfit"/>
                 <w:b w:val="false"/>
                 <w:bCs w:val="false"/>
                 <w:sz w:val="18"/>
@@ -1470,7 +1470,7 @@
           <w:p>
             <w:r>
               <w:rPr>
-                <w:rFonts w:ascii="Calibri" w:cs="Calibri" w:eastAsia="Calibri" w:hAnsi="Calibri"/>
+                <w:rFonts w:ascii="Outfit" w:cs="Outfit" w:eastAsia="Outfit" w:hAnsi="Outfit"/>
                 <w:b w:val="false"/>
                 <w:bCs w:val="false"/>
                 <w:sz w:val="18"/>
@@ -1499,7 +1499,7 @@
           <w:p>
             <w:r>
               <w:rPr>
-                <w:rFonts w:ascii="Calibri" w:cs="Calibri" w:eastAsia="Calibri" w:hAnsi="Calibri"/>
+                <w:rFonts w:ascii="Outfit" w:cs="Outfit" w:eastAsia="Outfit" w:hAnsi="Outfit"/>
                 <w:b/>
                 <w:bCs/>
                 <w:sz w:val="18"/>
@@ -1509,7 +1509,7 @@
             </w:r>
             <w:r>
               <w:rPr>
-                <w:rFonts w:ascii="Calibri" w:cs="Calibri" w:eastAsia="Calibri" w:hAnsi="Calibri"/>
+                <w:rFonts w:ascii="Outfit" w:cs="Outfit" w:eastAsia="Outfit" w:hAnsi="Outfit"/>
                 <w:b w:val="false"/>
                 <w:bCs w:val="false"/>
                 <w:sz w:val="18"/>
@@ -1538,7 +1538,7 @@
           <w:p>
             <w:r>
               <w:rPr>
-                <w:rFonts w:ascii="Calibri" w:cs="Calibri" w:eastAsia="Calibri" w:hAnsi="Calibri"/>
+                <w:rFonts w:ascii="Outfit" w:cs="Outfit" w:eastAsia="Outfit" w:hAnsi="Outfit"/>
                 <w:b w:val="false"/>
                 <w:bCs w:val="false"/>
                 <w:sz w:val="18"/>
@@ -1567,7 +1567,7 @@
           <w:p>
             <w:r>
               <w:rPr>
-                <w:rFonts w:ascii="Calibri" w:cs="Calibri" w:eastAsia="Calibri" w:hAnsi="Calibri"/>
+                <w:rFonts w:ascii="Outfit" w:cs="Outfit" w:eastAsia="Outfit" w:hAnsi="Outfit"/>
                 <w:b w:val="false"/>
                 <w:bCs w:val="false"/>
                 <w:sz w:val="18"/>
@@ -1596,7 +1596,7 @@
           <w:p>
             <w:r>
               <w:rPr>
-                <w:rFonts w:ascii="Calibri" w:cs="Calibri" w:eastAsia="Calibri" w:hAnsi="Calibri"/>
+                <w:rFonts w:ascii="Outfit" w:cs="Outfit" w:eastAsia="Outfit" w:hAnsi="Outfit"/>
                 <w:b w:val="false"/>
                 <w:bCs w:val="false"/>
                 <w:sz w:val="18"/>
@@ -1625,7 +1625,7 @@
           <w:p>
             <w:r>
               <w:rPr>
-                <w:rFonts w:ascii="Calibri" w:cs="Calibri" w:eastAsia="Calibri" w:hAnsi="Calibri"/>
+                <w:rFonts w:ascii="Outfit" w:cs="Outfit" w:eastAsia="Outfit" w:hAnsi="Outfit"/>
                 <w:b w:val="false"/>
                 <w:bCs w:val="false"/>
                 <w:sz w:val="18"/>
@@ -1644,7 +1644,7 @@
       </w:pPr>
       <w:r>
         <w:rPr>
-          <w:rFonts w:ascii="Calibri" w:cs="Calibri" w:eastAsia="Calibri" w:hAnsi="Calibri"/>
+          <w:rFonts w:ascii="Outfit" w:cs="Outfit" w:eastAsia="Outfit" w:hAnsi="Outfit"/>
         </w:rPr>
         <w:t xml:space="preserve">B. Ważne (dziś szacunek, z danymi miasta będą wiarygodne)</w:t>
       </w:r>
@@ -1693,7 +1693,7 @@
           <w:p>
             <w:r>
               <w:rPr>
-                <w:rFonts w:ascii="Calibri" w:cs="Calibri" w:eastAsia="Calibri" w:hAnsi="Calibri"/>
+                <w:rFonts w:ascii="Outfit" w:cs="Outfit" w:eastAsia="Outfit" w:hAnsi="Outfit"/>
                 <w:b/>
                 <w:bCs/>
                 <w:sz w:val="18"/>
@@ -1723,7 +1723,7 @@
           <w:p>
             <w:r>
               <w:rPr>
-                <w:rFonts w:ascii="Calibri" w:cs="Calibri" w:eastAsia="Calibri" w:hAnsi="Calibri"/>
+                <w:rFonts w:ascii="Outfit" w:cs="Outfit" w:eastAsia="Outfit" w:hAnsi="Outfit"/>
                 <w:b/>
                 <w:bCs/>
                 <w:sz w:val="18"/>
@@ -1753,7 +1753,7 @@
           <w:p>
             <w:r>
               <w:rPr>
-                <w:rFonts w:ascii="Calibri" w:cs="Calibri" w:eastAsia="Calibri" w:hAnsi="Calibri"/>
+                <w:rFonts w:ascii="Outfit" w:cs="Outfit" w:eastAsia="Outfit" w:hAnsi="Outfit"/>
                 <w:b/>
                 <w:bCs/>
                 <w:sz w:val="18"/>
@@ -1783,7 +1783,7 @@
           <w:p>
             <w:r>
               <w:rPr>
-                <w:rFonts w:ascii="Calibri" w:cs="Calibri" w:eastAsia="Calibri" w:hAnsi="Calibri"/>
+                <w:rFonts w:ascii="Outfit" w:cs="Outfit" w:eastAsia="Outfit" w:hAnsi="Outfit"/>
                 <w:b/>
                 <w:bCs/>
                 <w:sz w:val="18"/>
@@ -1813,7 +1813,7 @@
           <w:p>
             <w:r>
               <w:rPr>
-                <w:rFonts w:ascii="Calibri" w:cs="Calibri" w:eastAsia="Calibri" w:hAnsi="Calibri"/>
+                <w:rFonts w:ascii="Outfit" w:cs="Outfit" w:eastAsia="Outfit" w:hAnsi="Outfit"/>
                 <w:b/>
                 <w:bCs/>
                 <w:sz w:val="18"/>
@@ -1843,7 +1843,7 @@
           <w:p>
             <w:r>
               <w:rPr>
-                <w:rFonts w:ascii="Calibri" w:cs="Calibri" w:eastAsia="Calibri" w:hAnsi="Calibri"/>
+                <w:rFonts w:ascii="Outfit" w:cs="Outfit" w:eastAsia="Outfit" w:hAnsi="Outfit"/>
                 <w:b/>
                 <w:bCs/>
                 <w:sz w:val="18"/>
@@ -1874,7 +1874,7 @@
           <w:p>
             <w:r>
               <w:rPr>
-                <w:rFonts w:ascii="Calibri" w:cs="Calibri" w:eastAsia="Calibri" w:hAnsi="Calibri"/>
+                <w:rFonts w:ascii="Outfit" w:cs="Outfit" w:eastAsia="Outfit" w:hAnsi="Outfit"/>
                 <w:b w:val="false"/>
                 <w:bCs w:val="false"/>
                 <w:sz w:val="18"/>
@@ -1903,7 +1903,7 @@
           <w:p>
             <w:r>
               <w:rPr>
-                <w:rFonts w:ascii="Calibri" w:cs="Calibri" w:eastAsia="Calibri" w:hAnsi="Calibri"/>
+                <w:rFonts w:ascii="Outfit" w:cs="Outfit" w:eastAsia="Outfit" w:hAnsi="Outfit"/>
                 <w:b/>
                 <w:bCs/>
                 <w:sz w:val="18"/>
@@ -1913,7 +1913,7 @@
             </w:r>
             <w:r>
               <w:rPr>
-                <w:rFonts w:ascii="Calibri" w:cs="Calibri" w:eastAsia="Calibri" w:hAnsi="Calibri"/>
+                <w:rFonts w:ascii="Outfit" w:cs="Outfit" w:eastAsia="Outfit" w:hAnsi="Outfit"/>
                 <w:b w:val="false"/>
                 <w:bCs w:val="false"/>
                 <w:sz w:val="18"/>
@@ -1942,7 +1942,7 @@
           <w:p>
             <w:r>
               <w:rPr>
-                <w:rFonts w:ascii="Calibri" w:cs="Calibri" w:eastAsia="Calibri" w:hAnsi="Calibri"/>
+                <w:rFonts w:ascii="Outfit" w:cs="Outfit" w:eastAsia="Outfit" w:hAnsi="Outfit"/>
                 <w:b w:val="false"/>
                 <w:bCs w:val="false"/>
                 <w:sz w:val="18"/>
@@ -1971,7 +1971,7 @@
           <w:p>
             <w:r>
               <w:rPr>
-                <w:rFonts w:ascii="Calibri" w:cs="Calibri" w:eastAsia="Calibri" w:hAnsi="Calibri"/>
+                <w:rFonts w:ascii="Outfit" w:cs="Outfit" w:eastAsia="Outfit" w:hAnsi="Outfit"/>
                 <w:b w:val="false"/>
                 <w:bCs w:val="false"/>
                 <w:sz w:val="18"/>
@@ -2000,7 +2000,7 @@
           <w:p>
             <w:r>
               <w:rPr>
-                <w:rFonts w:ascii="Calibri" w:cs="Calibri" w:eastAsia="Calibri" w:hAnsi="Calibri"/>
+                <w:rFonts w:ascii="Outfit" w:cs="Outfit" w:eastAsia="Outfit" w:hAnsi="Outfit"/>
                 <w:b w:val="false"/>
                 <w:bCs w:val="false"/>
                 <w:sz w:val="18"/>
@@ -2029,7 +2029,7 @@
           <w:p>
             <w:r>
               <w:rPr>
-                <w:rFonts w:ascii="Calibri" w:cs="Calibri" w:eastAsia="Calibri" w:hAnsi="Calibri"/>
+                <w:rFonts w:ascii="Outfit" w:cs="Outfit" w:eastAsia="Outfit" w:hAnsi="Outfit"/>
                 <w:b w:val="false"/>
                 <w:bCs w:val="false"/>
                 <w:sz w:val="18"/>
@@ -2060,7 +2060,7 @@
           <w:p>
             <w:r>
               <w:rPr>
-                <w:rFonts w:ascii="Calibri" w:cs="Calibri" w:eastAsia="Calibri" w:hAnsi="Calibri"/>
+                <w:rFonts w:ascii="Outfit" w:cs="Outfit" w:eastAsia="Outfit" w:hAnsi="Outfit"/>
                 <w:b w:val="false"/>
                 <w:bCs w:val="false"/>
                 <w:sz w:val="18"/>
@@ -2089,7 +2089,7 @@
           <w:p>
             <w:r>
               <w:rPr>
-                <w:rFonts w:ascii="Calibri" w:cs="Calibri" w:eastAsia="Calibri" w:hAnsi="Calibri"/>
+                <w:rFonts w:ascii="Outfit" w:cs="Outfit" w:eastAsia="Outfit" w:hAnsi="Outfit"/>
                 <w:b/>
                 <w:bCs/>
                 <w:sz w:val="18"/>
@@ -2118,7 +2118,7 @@
           <w:p>
             <w:r>
               <w:rPr>
-                <w:rFonts w:ascii="Calibri" w:cs="Calibri" w:eastAsia="Calibri" w:hAnsi="Calibri"/>
+                <w:rFonts w:ascii="Outfit" w:cs="Outfit" w:eastAsia="Outfit" w:hAnsi="Outfit"/>
                 <w:b w:val="false"/>
                 <w:bCs w:val="false"/>
                 <w:sz w:val="18"/>
@@ -2147,7 +2147,7 @@
           <w:p>
             <w:r>
               <w:rPr>
-                <w:rFonts w:ascii="Calibri" w:cs="Calibri" w:eastAsia="Calibri" w:hAnsi="Calibri"/>
+                <w:rFonts w:ascii="Outfit" w:cs="Outfit" w:eastAsia="Outfit" w:hAnsi="Outfit"/>
                 <w:b w:val="false"/>
                 <w:bCs w:val="false"/>
                 <w:sz w:val="18"/>
@@ -2176,7 +2176,7 @@
           <w:p>
             <w:r>
               <w:rPr>
-                <w:rFonts w:ascii="Calibri" w:cs="Calibri" w:eastAsia="Calibri" w:hAnsi="Calibri"/>
+                <w:rFonts w:ascii="Outfit" w:cs="Outfit" w:eastAsia="Outfit" w:hAnsi="Outfit"/>
                 <w:b w:val="false"/>
                 <w:bCs w:val="false"/>
                 <w:sz w:val="18"/>
@@ -2205,7 +2205,7 @@
           <w:p>
             <w:r>
               <w:rPr>
-                <w:rFonts w:ascii="Calibri" w:cs="Calibri" w:eastAsia="Calibri" w:hAnsi="Calibri"/>
+                <w:rFonts w:ascii="Outfit" w:cs="Outfit" w:eastAsia="Outfit" w:hAnsi="Outfit"/>
                 <w:b w:val="false"/>
                 <w:bCs w:val="false"/>
                 <w:sz w:val="18"/>
@@ -2236,7 +2236,7 @@
           <w:p>
             <w:r>
               <w:rPr>
-                <w:rFonts w:ascii="Calibri" w:cs="Calibri" w:eastAsia="Calibri" w:hAnsi="Calibri"/>
+                <w:rFonts w:ascii="Outfit" w:cs="Outfit" w:eastAsia="Outfit" w:hAnsi="Outfit"/>
                 <w:b w:val="false"/>
                 <w:bCs w:val="false"/>
                 <w:sz w:val="18"/>
@@ -2265,7 +2265,7 @@
           <w:p>
             <w:r>
               <w:rPr>
-                <w:rFonts w:ascii="Calibri" w:cs="Calibri" w:eastAsia="Calibri" w:hAnsi="Calibri"/>
+                <w:rFonts w:ascii="Outfit" w:cs="Outfit" w:eastAsia="Outfit" w:hAnsi="Outfit"/>
                 <w:b/>
                 <w:bCs/>
                 <w:sz w:val="18"/>
@@ -2294,7 +2294,7 @@
           <w:p>
             <w:r>
               <w:rPr>
-                <w:rFonts w:ascii="Calibri" w:cs="Calibri" w:eastAsia="Calibri" w:hAnsi="Calibri"/>
+                <w:rFonts w:ascii="Outfit" w:cs="Outfit" w:eastAsia="Outfit" w:hAnsi="Outfit"/>
                 <w:b w:val="false"/>
                 <w:bCs w:val="false"/>
                 <w:sz w:val="18"/>
@@ -2323,7 +2323,7 @@
           <w:p>
             <w:r>
               <w:rPr>
-                <w:rFonts w:ascii="Calibri" w:cs="Calibri" w:eastAsia="Calibri" w:hAnsi="Calibri"/>
+                <w:rFonts w:ascii="Outfit" w:cs="Outfit" w:eastAsia="Outfit" w:hAnsi="Outfit"/>
                 <w:b w:val="false"/>
                 <w:bCs w:val="false"/>
                 <w:sz w:val="18"/>
@@ -2352,7 +2352,7 @@
           <w:p>
             <w:r>
               <w:rPr>
-                <w:rFonts w:ascii="Calibri" w:cs="Calibri" w:eastAsia="Calibri" w:hAnsi="Calibri"/>
+                <w:rFonts w:ascii="Outfit" w:cs="Outfit" w:eastAsia="Outfit" w:hAnsi="Outfit"/>
                 <w:b w:val="false"/>
                 <w:bCs w:val="false"/>
                 <w:sz w:val="18"/>
@@ -2381,7 +2381,7 @@
           <w:p>
             <w:r>
               <w:rPr>
-                <w:rFonts w:ascii="Calibri" w:cs="Calibri" w:eastAsia="Calibri" w:hAnsi="Calibri"/>
+                <w:rFonts w:ascii="Outfit" w:cs="Outfit" w:eastAsia="Outfit" w:hAnsi="Outfit"/>
                 <w:b w:val="false"/>
                 <w:bCs w:val="false"/>
                 <w:sz w:val="18"/>
@@ -2412,7 +2412,7 @@
           <w:p>
             <w:r>
               <w:rPr>
-                <w:rFonts w:ascii="Calibri" w:cs="Calibri" w:eastAsia="Calibri" w:hAnsi="Calibri"/>
+                <w:rFonts w:ascii="Outfit" w:cs="Outfit" w:eastAsia="Outfit" w:hAnsi="Outfit"/>
                 <w:b w:val="false"/>
                 <w:bCs w:val="false"/>
                 <w:sz w:val="18"/>
@@ -2441,7 +2441,7 @@
           <w:p>
             <w:r>
               <w:rPr>
-                <w:rFonts w:ascii="Calibri" w:cs="Calibri" w:eastAsia="Calibri" w:hAnsi="Calibri"/>
+                <w:rFonts w:ascii="Outfit" w:cs="Outfit" w:eastAsia="Outfit" w:hAnsi="Outfit"/>
                 <w:b/>
                 <w:bCs/>
                 <w:sz w:val="18"/>
@@ -2451,7 +2451,7 @@
             </w:r>
             <w:r>
               <w:rPr>
-                <w:rFonts w:ascii="Calibri" w:cs="Calibri" w:eastAsia="Calibri" w:hAnsi="Calibri"/>
+                <w:rFonts w:ascii="Outfit" w:cs="Outfit" w:eastAsia="Outfit" w:hAnsi="Outfit"/>
                 <w:b w:val="false"/>
                 <w:bCs w:val="false"/>
                 <w:sz w:val="18"/>
@@ -2480,7 +2480,7 @@
           <w:p>
             <w:r>
               <w:rPr>
-                <w:rFonts w:ascii="Calibri" w:cs="Calibri" w:eastAsia="Calibri" w:hAnsi="Calibri"/>
+                <w:rFonts w:ascii="Outfit" w:cs="Outfit" w:eastAsia="Outfit" w:hAnsi="Outfit"/>
                 <w:b w:val="false"/>
                 <w:bCs w:val="false"/>
                 <w:sz w:val="18"/>
@@ -2509,7 +2509,7 @@
           <w:p>
             <w:r>
               <w:rPr>
-                <w:rFonts w:ascii="Calibri" w:cs="Calibri" w:eastAsia="Calibri" w:hAnsi="Calibri"/>
+                <w:rFonts w:ascii="Outfit" w:cs="Outfit" w:eastAsia="Outfit" w:hAnsi="Outfit"/>
                 <w:b w:val="false"/>
                 <w:bCs w:val="false"/>
                 <w:sz w:val="18"/>
@@ -2538,7 +2538,7 @@
           <w:p>
             <w:r>
               <w:rPr>
-                <w:rFonts w:ascii="Calibri" w:cs="Calibri" w:eastAsia="Calibri" w:hAnsi="Calibri"/>
+                <w:rFonts w:ascii="Outfit" w:cs="Outfit" w:eastAsia="Outfit" w:hAnsi="Outfit"/>
                 <w:b w:val="false"/>
                 <w:bCs w:val="false"/>
                 <w:sz w:val="18"/>
@@ -2567,7 +2567,7 @@
           <w:p>
             <w:r>
               <w:rPr>
-                <w:rFonts w:ascii="Calibri" w:cs="Calibri" w:eastAsia="Calibri" w:hAnsi="Calibri"/>
+                <w:rFonts w:ascii="Outfit" w:cs="Outfit" w:eastAsia="Outfit" w:hAnsi="Outfit"/>
                 <w:b w:val="false"/>
                 <w:bCs w:val="false"/>
                 <w:sz w:val="18"/>
@@ -2598,7 +2598,7 @@
           <w:p>
             <w:r>
               <w:rPr>
-                <w:rFonts w:ascii="Calibri" w:cs="Calibri" w:eastAsia="Calibri" w:hAnsi="Calibri"/>
+                <w:rFonts w:ascii="Outfit" w:cs="Outfit" w:eastAsia="Outfit" w:hAnsi="Outfit"/>
                 <w:b w:val="false"/>
                 <w:bCs w:val="false"/>
                 <w:sz w:val="18"/>
@@ -2627,7 +2627,7 @@
           <w:p>
             <w:r>
               <w:rPr>
-                <w:rFonts w:ascii="Calibri" w:cs="Calibri" w:eastAsia="Calibri" w:hAnsi="Calibri"/>
+                <w:rFonts w:ascii="Outfit" w:cs="Outfit" w:eastAsia="Outfit" w:hAnsi="Outfit"/>
                 <w:b/>
                 <w:bCs/>
                 <w:sz w:val="18"/>
@@ -2656,7 +2656,7 @@
           <w:p>
             <w:r>
               <w:rPr>
-                <w:rFonts w:ascii="Calibri" w:cs="Calibri" w:eastAsia="Calibri" w:hAnsi="Calibri"/>
+                <w:rFonts w:ascii="Outfit" w:cs="Outfit" w:eastAsia="Outfit" w:hAnsi="Outfit"/>
                 <w:b w:val="false"/>
                 <w:bCs w:val="false"/>
                 <w:sz w:val="18"/>
@@ -2685,7 +2685,7 @@
           <w:p>
             <w:r>
               <w:rPr>
-                <w:rFonts w:ascii="Calibri" w:cs="Calibri" w:eastAsia="Calibri" w:hAnsi="Calibri"/>
+                <w:rFonts w:ascii="Outfit" w:cs="Outfit" w:eastAsia="Outfit" w:hAnsi="Outfit"/>
                 <w:b w:val="false"/>
                 <w:bCs w:val="false"/>
                 <w:sz w:val="18"/>
@@ -2714,7 +2714,7 @@
           <w:p>
             <w:r>
               <w:rPr>
-                <w:rFonts w:ascii="Calibri" w:cs="Calibri" w:eastAsia="Calibri" w:hAnsi="Calibri"/>
+                <w:rFonts w:ascii="Outfit" w:cs="Outfit" w:eastAsia="Outfit" w:hAnsi="Outfit"/>
                 <w:b w:val="false"/>
                 <w:bCs w:val="false"/>
                 <w:sz w:val="18"/>
@@ -2743,7 +2743,7 @@
           <w:p>
             <w:r>
               <w:rPr>
-                <w:rFonts w:ascii="Calibri" w:cs="Calibri" w:eastAsia="Calibri" w:hAnsi="Calibri"/>
+                <w:rFonts w:ascii="Outfit" w:cs="Outfit" w:eastAsia="Outfit" w:hAnsi="Outfit"/>
                 <w:b w:val="false"/>
                 <w:bCs w:val="false"/>
                 <w:sz w:val="18"/>
@@ -2774,7 +2774,7 @@
           <w:p>
             <w:r>
               <w:rPr>
-                <w:rFonts w:ascii="Calibri" w:cs="Calibri" w:eastAsia="Calibri" w:hAnsi="Calibri"/>
+                <w:rFonts w:ascii="Outfit" w:cs="Outfit" w:eastAsia="Outfit" w:hAnsi="Outfit"/>
                 <w:b w:val="false"/>
                 <w:bCs w:val="false"/>
                 <w:sz w:val="18"/>
@@ -2803,7 +2803,7 @@
           <w:p>
             <w:r>
               <w:rPr>
-                <w:rFonts w:ascii="Calibri" w:cs="Calibri" w:eastAsia="Calibri" w:hAnsi="Calibri"/>
+                <w:rFonts w:ascii="Outfit" w:cs="Outfit" w:eastAsia="Outfit" w:hAnsi="Outfit"/>
                 <w:b/>
                 <w:bCs/>
                 <w:sz w:val="18"/>
@@ -2813,7 +2813,7 @@
             </w:r>
             <w:r>
               <w:rPr>
-                <w:rFonts w:ascii="Calibri" w:cs="Calibri" w:eastAsia="Calibri" w:hAnsi="Calibri"/>
+                <w:rFonts w:ascii="Outfit" w:cs="Outfit" w:eastAsia="Outfit" w:hAnsi="Outfit"/>
                 <w:b w:val="false"/>
                 <w:bCs w:val="false"/>
                 <w:sz w:val="18"/>
@@ -2842,7 +2842,7 @@
           <w:p>
             <w:r>
               <w:rPr>
-                <w:rFonts w:ascii="Calibri" w:cs="Calibri" w:eastAsia="Calibri" w:hAnsi="Calibri"/>
+                <w:rFonts w:ascii="Outfit" w:cs="Outfit" w:eastAsia="Outfit" w:hAnsi="Outfit"/>
                 <w:b w:val="false"/>
                 <w:bCs w:val="false"/>
                 <w:sz w:val="18"/>
@@ -2871,7 +2871,7 @@
           <w:p>
             <w:r>
               <w:rPr>
-                <w:rFonts w:ascii="Calibri" w:cs="Calibri" w:eastAsia="Calibri" w:hAnsi="Calibri"/>
+                <w:rFonts w:ascii="Outfit" w:cs="Outfit" w:eastAsia="Outfit" w:hAnsi="Outfit"/>
                 <w:b w:val="false"/>
                 <w:bCs w:val="false"/>
                 <w:sz w:val="18"/>
@@ -2900,7 +2900,7 @@
           <w:p>
             <w:r>
               <w:rPr>
-                <w:rFonts w:ascii="Calibri" w:cs="Calibri" w:eastAsia="Calibri" w:hAnsi="Calibri"/>
+                <w:rFonts w:ascii="Outfit" w:cs="Outfit" w:eastAsia="Outfit" w:hAnsi="Outfit"/>
                 <w:b w:val="false"/>
                 <w:bCs w:val="false"/>
                 <w:sz w:val="18"/>
@@ -2929,7 +2929,7 @@
           <w:p>
             <w:r>
               <w:rPr>
-                <w:rFonts w:ascii="Calibri" w:cs="Calibri" w:eastAsia="Calibri" w:hAnsi="Calibri"/>
+                <w:rFonts w:ascii="Outfit" w:cs="Outfit" w:eastAsia="Outfit" w:hAnsi="Outfit"/>
                 <w:b w:val="false"/>
                 <w:bCs w:val="false"/>
                 <w:sz w:val="18"/>
@@ -2960,7 +2960,7 @@
           <w:p>
             <w:r>
               <w:rPr>
-                <w:rFonts w:ascii="Calibri" w:cs="Calibri" w:eastAsia="Calibri" w:hAnsi="Calibri"/>
+                <w:rFonts w:ascii="Outfit" w:cs="Outfit" w:eastAsia="Outfit" w:hAnsi="Outfit"/>
                 <w:b w:val="false"/>
                 <w:bCs w:val="false"/>
                 <w:sz w:val="18"/>
@@ -2989,7 +2989,7 @@
           <w:p>
             <w:r>
               <w:rPr>
-                <w:rFonts w:ascii="Calibri" w:cs="Calibri" w:eastAsia="Calibri" w:hAnsi="Calibri"/>
+                <w:rFonts w:ascii="Outfit" w:cs="Outfit" w:eastAsia="Outfit" w:hAnsi="Outfit"/>
                 <w:b/>
                 <w:bCs/>
                 <w:sz w:val="18"/>
@@ -3018,7 +3018,7 @@
           <w:p>
             <w:r>
               <w:rPr>
-                <w:rFonts w:ascii="Calibri" w:cs="Calibri" w:eastAsia="Calibri" w:hAnsi="Calibri"/>
+                <w:rFonts w:ascii="Outfit" w:cs="Outfit" w:eastAsia="Outfit" w:hAnsi="Outfit"/>
                 <w:b w:val="false"/>
                 <w:bCs w:val="false"/>
                 <w:sz w:val="18"/>
@@ -3047,7 +3047,7 @@
           <w:p>
             <w:r>
               <w:rPr>
-                <w:rFonts w:ascii="Calibri" w:cs="Calibri" w:eastAsia="Calibri" w:hAnsi="Calibri"/>
+                <w:rFonts w:ascii="Outfit" w:cs="Outfit" w:eastAsia="Outfit" w:hAnsi="Outfit"/>
                 <w:b w:val="false"/>
                 <w:bCs w:val="false"/>
                 <w:sz w:val="18"/>
@@ -3076,7 +3076,7 @@
           <w:p>
             <w:r>
               <w:rPr>
-                <w:rFonts w:ascii="Calibri" w:cs="Calibri" w:eastAsia="Calibri" w:hAnsi="Calibri"/>
+                <w:rFonts w:ascii="Outfit" w:cs="Outfit" w:eastAsia="Outfit" w:hAnsi="Outfit"/>
                 <w:b w:val="false"/>
                 <w:bCs w:val="false"/>
                 <w:sz w:val="18"/>
@@ -3105,7 +3105,7 @@
           <w:p>
             <w:r>
               <w:rPr>
-                <w:rFonts w:ascii="Calibri" w:cs="Calibri" w:eastAsia="Calibri" w:hAnsi="Calibri"/>
+                <w:rFonts w:ascii="Outfit" w:cs="Outfit" w:eastAsia="Outfit" w:hAnsi="Outfit"/>
                 <w:b w:val="false"/>
                 <w:bCs w:val="false"/>
                 <w:sz w:val="18"/>
@@ -3124,7 +3124,7 @@
       </w:pPr>
       <w:r>
         <w:rPr>
-          <w:rFonts w:ascii="Calibri" w:cs="Calibri" w:eastAsia="Calibri" w:hAnsi="Calibri"/>
+          <w:rFonts w:ascii="Outfit" w:cs="Outfit" w:eastAsia="Outfit" w:hAnsi="Outfit"/>
         </w:rPr>
         <w:t xml:space="preserve">C. Partnerzy i grywalizacja</w:t>
       </w:r>
@@ -3172,7 +3172,7 @@
           <w:p>
             <w:r>
               <w:rPr>
-                <w:rFonts w:ascii="Calibri" w:cs="Calibri" w:eastAsia="Calibri" w:hAnsi="Calibri"/>
+                <w:rFonts w:ascii="Outfit" w:cs="Outfit" w:eastAsia="Outfit" w:hAnsi="Outfit"/>
                 <w:b/>
                 <w:bCs/>
                 <w:sz w:val="18"/>
@@ -3202,7 +3202,7 @@
           <w:p>
             <w:r>
               <w:rPr>
-                <w:rFonts w:ascii="Calibri" w:cs="Calibri" w:eastAsia="Calibri" w:hAnsi="Calibri"/>
+                <w:rFonts w:ascii="Outfit" w:cs="Outfit" w:eastAsia="Outfit" w:hAnsi="Outfit"/>
                 <w:b/>
                 <w:bCs/>
                 <w:sz w:val="18"/>
@@ -3232,7 +3232,7 @@
           <w:p>
             <w:r>
               <w:rPr>
-                <w:rFonts w:ascii="Calibri" w:cs="Calibri" w:eastAsia="Calibri" w:hAnsi="Calibri"/>
+                <w:rFonts w:ascii="Outfit" w:cs="Outfit" w:eastAsia="Outfit" w:hAnsi="Outfit"/>
                 <w:b/>
                 <w:bCs/>
                 <w:sz w:val="18"/>
@@ -3262,7 +3262,7 @@
           <w:p>
             <w:r>
               <w:rPr>
-                <w:rFonts w:ascii="Calibri" w:cs="Calibri" w:eastAsia="Calibri" w:hAnsi="Calibri"/>
+                <w:rFonts w:ascii="Outfit" w:cs="Outfit" w:eastAsia="Outfit" w:hAnsi="Outfit"/>
                 <w:b/>
                 <w:bCs/>
                 <w:sz w:val="18"/>
@@ -3292,7 +3292,7 @@
           <w:p>
             <w:r>
               <w:rPr>
-                <w:rFonts w:ascii="Calibri" w:cs="Calibri" w:eastAsia="Calibri" w:hAnsi="Calibri"/>
+                <w:rFonts w:ascii="Outfit" w:cs="Outfit" w:eastAsia="Outfit" w:hAnsi="Outfit"/>
                 <w:b/>
                 <w:bCs/>
                 <w:sz w:val="18"/>
@@ -3323,7 +3323,7 @@
           <w:p>
             <w:r>
               <w:rPr>
-                <w:rFonts w:ascii="Calibri" w:cs="Calibri" w:eastAsia="Calibri" w:hAnsi="Calibri"/>
+                <w:rFonts w:ascii="Outfit" w:cs="Outfit" w:eastAsia="Outfit" w:hAnsi="Outfit"/>
                 <w:b w:val="false"/>
                 <w:bCs w:val="false"/>
                 <w:sz w:val="18"/>
@@ -3352,7 +3352,7 @@
           <w:p>
             <w:r>
               <w:rPr>
-                <w:rFonts w:ascii="Calibri" w:cs="Calibri" w:eastAsia="Calibri" w:hAnsi="Calibri"/>
+                <w:rFonts w:ascii="Outfit" w:cs="Outfit" w:eastAsia="Outfit" w:hAnsi="Outfit"/>
                 <w:b/>
                 <w:bCs/>
                 <w:sz w:val="18"/>
@@ -3362,7 +3362,7 @@
             </w:r>
             <w:r>
               <w:rPr>
-                <w:rFonts w:ascii="Calibri" w:cs="Calibri" w:eastAsia="Calibri" w:hAnsi="Calibri"/>
+                <w:rFonts w:ascii="Outfit" w:cs="Outfit" w:eastAsia="Outfit" w:hAnsi="Outfit"/>
                 <w:b w:val="false"/>
                 <w:bCs w:val="false"/>
                 <w:sz w:val="18"/>
@@ -3391,7 +3391,7 @@
           <w:p>
             <w:r>
               <w:rPr>
-                <w:rFonts w:ascii="Calibri" w:cs="Calibri" w:eastAsia="Calibri" w:hAnsi="Calibri"/>
+                <w:rFonts w:ascii="Outfit" w:cs="Outfit" w:eastAsia="Outfit" w:hAnsi="Outfit"/>
                 <w:b w:val="false"/>
                 <w:bCs w:val="false"/>
                 <w:sz w:val="18"/>
@@ -3420,7 +3420,7 @@
           <w:p>
             <w:r>
               <w:rPr>
-                <w:rFonts w:ascii="Calibri" w:cs="Calibri" w:eastAsia="Calibri" w:hAnsi="Calibri"/>
+                <w:rFonts w:ascii="Outfit" w:cs="Outfit" w:eastAsia="Outfit" w:hAnsi="Outfit"/>
                 <w:b w:val="false"/>
                 <w:bCs w:val="false"/>
                 <w:sz w:val="18"/>
@@ -3449,7 +3449,7 @@
           <w:p>
             <w:r>
               <w:rPr>
-                <w:rFonts w:ascii="Calibri" w:cs="Calibri" w:eastAsia="Calibri" w:hAnsi="Calibri"/>
+                <w:rFonts w:ascii="Outfit" w:cs="Outfit" w:eastAsia="Outfit" w:hAnsi="Outfit"/>
                 <w:b w:val="false"/>
                 <w:bCs w:val="false"/>
                 <w:sz w:val="18"/>
@@ -3480,7 +3480,7 @@
           <w:p>
             <w:r>
               <w:rPr>
-                <w:rFonts w:ascii="Calibri" w:cs="Calibri" w:eastAsia="Calibri" w:hAnsi="Calibri"/>
+                <w:rFonts w:ascii="Outfit" w:cs="Outfit" w:eastAsia="Outfit" w:hAnsi="Outfit"/>
                 <w:b w:val="false"/>
                 <w:bCs w:val="false"/>
                 <w:sz w:val="18"/>
@@ -3509,7 +3509,7 @@
           <w:p>
             <w:r>
               <w:rPr>
-                <w:rFonts w:ascii="Calibri" w:cs="Calibri" w:eastAsia="Calibri" w:hAnsi="Calibri"/>
+                <w:rFonts w:ascii="Outfit" w:cs="Outfit" w:eastAsia="Outfit" w:hAnsi="Outfit"/>
                 <w:b/>
                 <w:bCs/>
                 <w:sz w:val="18"/>
@@ -3519,7 +3519,7 @@
             </w:r>
             <w:r>
               <w:rPr>
-                <w:rFonts w:ascii="Calibri" w:cs="Calibri" w:eastAsia="Calibri" w:hAnsi="Calibri"/>
+                <w:rFonts w:ascii="Outfit" w:cs="Outfit" w:eastAsia="Outfit" w:hAnsi="Outfit"/>
                 <w:b w:val="false"/>
                 <w:bCs w:val="false"/>
                 <w:sz w:val="18"/>
@@ -3548,7 +3548,7 @@
           <w:p>
             <w:r>
               <w:rPr>
-                <w:rFonts w:ascii="Calibri" w:cs="Calibri" w:eastAsia="Calibri" w:hAnsi="Calibri"/>
+                <w:rFonts w:ascii="Outfit" w:cs="Outfit" w:eastAsia="Outfit" w:hAnsi="Outfit"/>
                 <w:b w:val="false"/>
                 <w:bCs w:val="false"/>
                 <w:sz w:val="18"/>
@@ -3577,7 +3577,7 @@
           <w:p>
             <w:r>
               <w:rPr>
-                <w:rFonts w:ascii="Calibri" w:cs="Calibri" w:eastAsia="Calibri" w:hAnsi="Calibri"/>
+                <w:rFonts w:ascii="Outfit" w:cs="Outfit" w:eastAsia="Outfit" w:hAnsi="Outfit"/>
                 <w:b w:val="false"/>
                 <w:bCs w:val="false"/>
                 <w:sz w:val="18"/>
@@ -3606,7 +3606,7 @@
           <w:p>
             <w:r>
               <w:rPr>
-                <w:rFonts w:ascii="Calibri" w:cs="Calibri" w:eastAsia="Calibri" w:hAnsi="Calibri"/>
+                <w:rFonts w:ascii="Outfit" w:cs="Outfit" w:eastAsia="Outfit" w:hAnsi="Outfit"/>
                 <w:b w:val="false"/>
                 <w:bCs w:val="false"/>
                 <w:sz w:val="18"/>
@@ -3625,7 +3625,7 @@
       </w:pPr>
       <w:r>
         <w:rPr>
-          <w:rFonts w:ascii="Calibri" w:cs="Calibri" w:eastAsia="Calibri" w:hAnsi="Calibri"/>
+          <w:rFonts w:ascii="Outfit" w:cs="Outfit" w:eastAsia="Outfit" w:hAnsi="Outfit"/>
         </w:rPr>
         <w:t xml:space="preserve">Już działa z publicznych źródeł (nic nie trzeba zamawiać)</w:t>
       </w:r>
@@ -3641,7 +3641,7 @@
       </w:pPr>
       <w:r>
         <w:rPr>
-          <w:rFonts w:ascii="Calibri" w:cs="Calibri" w:eastAsia="Calibri" w:hAnsi="Calibri"/>
+          <w:rFonts w:ascii="Outfit" w:cs="Outfit" w:eastAsia="Outfit" w:hAnsi="Outfit"/>
           <w:sz w:val="22"/>
           <w:szCs w:val="22"/>
         </w:rPr>
@@ -3659,7 +3659,7 @@
       </w:pPr>
       <w:r>
         <w:rPr>
-          <w:rFonts w:ascii="Calibri" w:cs="Calibri" w:eastAsia="Calibri" w:hAnsi="Calibri"/>
+          <w:rFonts w:ascii="Outfit" w:cs="Outfit" w:eastAsia="Outfit" w:hAnsi="Outfit"/>
           <w:sz w:val="22"/>
           <w:szCs w:val="22"/>
         </w:rPr>
@@ -3677,7 +3677,7 @@
       </w:pPr>
       <w:r>
         <w:rPr>
-          <w:rFonts w:ascii="Calibri" w:cs="Calibri" w:eastAsia="Calibri" w:hAnsi="Calibri"/>
+          <w:rFonts w:ascii="Outfit" w:cs="Outfit" w:eastAsia="Outfit" w:hAnsi="Outfit"/>
           <w:sz w:val="22"/>
           <w:szCs w:val="22"/>
         </w:rPr>
@@ -3695,7 +3695,7 @@
       </w:pPr>
       <w:r>
         <w:rPr>
-          <w:rFonts w:ascii="Calibri" w:cs="Calibri" w:eastAsia="Calibri" w:hAnsi="Calibri"/>
+          <w:rFonts w:ascii="Outfit" w:cs="Outfit" w:eastAsia="Outfit" w:hAnsi="Outfit"/>
           <w:sz w:val="22"/>
           <w:szCs w:val="22"/>
         </w:rPr>
@@ -3709,7 +3709,7 @@
       </w:pPr>
       <w:r>
         <w:rPr>
-          <w:rFonts w:ascii="Calibri" w:cs="Calibri" w:eastAsia="Calibri" w:hAnsi="Calibri"/>
+          <w:rFonts w:ascii="Outfit" w:cs="Outfit" w:eastAsia="Outfit" w:hAnsi="Outfit"/>
         </w:rPr>
         <w:t xml:space="preserve">Kolejność</w:t>
       </w:r>
@@ -3720,7 +3720,7 @@
       </w:pPr>
       <w:r>
         <w:rPr>
-          <w:rFonts w:ascii="Calibri" w:cs="Calibri" w:eastAsia="Calibri" w:hAnsi="Calibri"/>
+          <w:rFonts w:ascii="Outfit" w:cs="Outfit" w:eastAsia="Outfit" w:hAnsi="Outfit"/>
           <w:sz w:val="22"/>
           <w:szCs w:val="22"/>
         </w:rPr>
@@ -3933,7 +3933,7 @@
   <w:docDefaults>
     <w:rPrDefault>
       <w:rPr>
-        <w:rFonts w:ascii="Calibri" w:cs="Calibri" w:eastAsia="Calibri" w:hAnsi="Calibri"/>
+        <w:rFonts w:ascii="Outfit" w:cs="Outfit" w:eastAsia="Outfit" w:hAnsi="Outfit"/>
       </w:rPr>
     </w:rPrDefault>
     <w:pPrDefault/>

</xml_diff>